<commit_message>
TS 3.3 Kramam comparison
</commit_message>
<xml_diff>
--- a/TS-Kramam/TS-3.3/TS 3.3 Sanskrit Krama Paatam Corrections.docx
+++ b/TS-Kramam/TS-3.3/TS 3.3 Sanskrit Krama Paatam Corrections.docx
@@ -1,6 +1,6 @@
 
 <file path=word/document.xml><?xml version="1.0" encoding="utf-8"?>
-<w:document xmlns:wpc="http://schemas.microsoft.com/office/word/2010/wordprocessingCanvas" xmlns:cx="http://schemas.microsoft.com/office/drawing/2014/chartex" xmlns:cx1="http://schemas.microsoft.com/office/drawing/2015/9/8/chartex" xmlns:mc="http://schemas.openxmlformats.org/markup-compatibility/2006" xmlns:o="urn:schemas-microsoft-com:office:office" xmlns:r="http://schemas.openxmlformats.org/officeDocument/2006/relationships" xmlns:m="http://schemas.openxmlformats.org/officeDocument/2006/math" xmlns:v="urn:schemas-microsoft-com:vml" xmlns:wp14="http://schemas.microsoft.com/office/word/2010/wordprocessingDrawing" xmlns:wp="http://schemas.openxmlformats.org/drawingml/2006/wordprocessingDrawing" xmlns:w10="urn:schemas-microsoft-com:office:word" xmlns:w="http://schemas.openxmlformats.org/wordprocessingml/2006/main" xmlns:w14="http://schemas.microsoft.com/office/word/2010/wordml" xmlns:w15="http://schemas.microsoft.com/office/word/2012/wordml" xmlns:w16se="http://schemas.microsoft.com/office/word/2015/wordml/symex" xmlns:wpg="http://schemas.microsoft.com/office/word/2010/wordprocessingGroup" xmlns:wpi="http://schemas.microsoft.com/office/word/2010/wordprocessingInk" xmlns:wne="http://schemas.microsoft.com/office/word/2006/wordml" xmlns:wps="http://schemas.microsoft.com/office/word/2010/wordprocessingShape" mc:Ignorable="w14 w15 w16se wp14">
+<w:document xmlns:wpc="http://schemas.microsoft.com/office/word/2010/wordprocessingCanvas" xmlns:cx="http://schemas.microsoft.com/office/drawing/2014/chartex" xmlns:cx1="http://schemas.microsoft.com/office/drawing/2015/9/8/chartex" xmlns:cx2="http://schemas.microsoft.com/office/drawing/2015/10/21/chartex" xmlns:cx3="http://schemas.microsoft.com/office/drawing/2016/5/9/chartex" xmlns:cx4="http://schemas.microsoft.com/office/drawing/2016/5/10/chartex" xmlns:cx5="http://schemas.microsoft.com/office/drawing/2016/5/11/chartex" xmlns:cx6="http://schemas.microsoft.com/office/drawing/2016/5/12/chartex" xmlns:cx7="http://schemas.microsoft.com/office/drawing/2016/5/13/chartex" xmlns:cx8="http://schemas.microsoft.com/office/drawing/2016/5/14/chartex" xmlns:mc="http://schemas.openxmlformats.org/markup-compatibility/2006" xmlns:aink="http://schemas.microsoft.com/office/drawing/2016/ink" xmlns:am3d="http://schemas.microsoft.com/office/drawing/2017/model3d" xmlns:o="urn:schemas-microsoft-com:office:office" xmlns:oel="http://schemas.microsoft.com/office/2019/extlst" xmlns:r="http://schemas.openxmlformats.org/officeDocument/2006/relationships" xmlns:m="http://schemas.openxmlformats.org/officeDocument/2006/math" xmlns:v="urn:schemas-microsoft-com:vml" xmlns:wp14="http://schemas.microsoft.com/office/word/2010/wordprocessingDrawing" xmlns:wp="http://schemas.openxmlformats.org/drawingml/2006/wordprocessingDrawing" xmlns:w10="urn:schemas-microsoft-com:office:word" xmlns:w="http://schemas.openxmlformats.org/wordprocessingml/2006/main" xmlns:w14="http://schemas.microsoft.com/office/word/2010/wordml" xmlns:w15="http://schemas.microsoft.com/office/word/2012/wordml" xmlns:w16cex="http://schemas.microsoft.com/office/word/2018/wordml/cex" xmlns:w16cid="http://schemas.microsoft.com/office/word/2016/wordml/cid" xmlns:w16="http://schemas.microsoft.com/office/word/2018/wordml" xmlns:w16du="http://schemas.microsoft.com/office/word/2023/wordml/word16du" xmlns:w16sdtdh="http://schemas.microsoft.com/office/word/2020/wordml/sdtdatahash" xmlns:w16sdtfl="http://schemas.microsoft.com/office/word/2024/wordml/sdtformatlock" xmlns:w16se="http://schemas.microsoft.com/office/word/2015/wordml/symex" xmlns:wpg="http://schemas.microsoft.com/office/word/2010/wordprocessingGroup" xmlns:wpi="http://schemas.microsoft.com/office/word/2010/wordprocessingInk" xmlns:wne="http://schemas.microsoft.com/office/word/2006/wordml" xmlns:wps="http://schemas.microsoft.com/office/word/2010/wordprocessingShape" mc:Ignorable="w14 w15 w16se w16cid w16 w16cex w16sdtdh w16sdtfl w16du wp14">
   <w:body>
     <w:p>
       <w:pPr>
@@ -24,136 +24,114 @@
         </w:rPr>
         <w:t xml:space="preserve">TS </w:t>
       </w:r>
+      <w:r>
+        <w:rPr>
+          <w:b/>
+          <w:bCs/>
+          <w:sz w:val="32"/>
+          <w:szCs w:val="32"/>
+          <w:u w:val="single"/>
+        </w:rPr>
+        <w:t>Krama</w:t>
+      </w:r>
+      <w:r>
+        <w:rPr>
+          <w:b/>
+          <w:bCs/>
+          <w:sz w:val="32"/>
+          <w:szCs w:val="32"/>
+          <w:u w:val="single"/>
+        </w:rPr>
+        <w:t xml:space="preserve"> Paatam – TS </w:t>
+      </w:r>
+      <w:r>
+        <w:rPr>
+          <w:b/>
+          <w:bCs/>
+          <w:sz w:val="32"/>
+          <w:szCs w:val="32"/>
+          <w:u w:val="single"/>
+        </w:rPr>
+        <w:t>3.3</w:t>
+      </w:r>
+      <w:r>
+        <w:rPr>
+          <w:b/>
+          <w:bCs/>
+          <w:sz w:val="32"/>
+          <w:szCs w:val="32"/>
+          <w:u w:val="single"/>
+        </w:rPr>
+        <w:t xml:space="preserve"> </w:t>
+      </w:r>
+      <w:r>
+        <w:rPr>
+          <w:b/>
+          <w:bCs/>
+          <w:sz w:val="32"/>
+          <w:szCs w:val="32"/>
+          <w:u w:val="single"/>
+        </w:rPr>
+        <w:t>Sanskrit</w:t>
+      </w:r>
+      <w:r>
+        <w:rPr>
+          <w:b/>
+          <w:bCs/>
+          <w:sz w:val="32"/>
+          <w:szCs w:val="32"/>
+          <w:u w:val="single"/>
+        </w:rPr>
+        <w:t xml:space="preserve"> Corrections –</w:t>
+      </w:r>
+      <w:r>
+        <w:rPr>
+          <w:b/>
+          <w:bCs/>
+          <w:sz w:val="32"/>
+          <w:szCs w:val="32"/>
+          <w:u w:val="single"/>
+        </w:rPr>
+        <w:t xml:space="preserve"> </w:t>
+      </w:r>
+      <w:r>
+        <w:rPr>
+          <w:b/>
+          <w:bCs/>
+          <w:sz w:val="32"/>
+          <w:szCs w:val="32"/>
+          <w:u w:val="single"/>
+        </w:rPr>
+        <w:t xml:space="preserve">Observed till </w:t>
+      </w:r>
       <w:proofErr w:type="spellStart"/>
       <w:r>
         <w:rPr>
           <w:b/>
           <w:bCs/>
-          <w:sz w:val="32"/>
-          <w:szCs w:val="32"/>
-          <w:u w:val="single"/>
-        </w:rPr>
-        <w:t>Krama</w:t>
+          <w:color w:val="EE0000"/>
+          <w:sz w:val="32"/>
+          <w:szCs w:val="32"/>
+          <w:highlight w:val="yellow"/>
+          <w:u w:val="single"/>
+        </w:rPr>
+        <w:t>xxxxxxx</w:t>
       </w:r>
       <w:proofErr w:type="spellEnd"/>
-      <w:r>
-        <w:rPr>
-          <w:b/>
-          <w:bCs/>
-          <w:sz w:val="32"/>
-          <w:szCs w:val="32"/>
-          <w:u w:val="single"/>
-        </w:rPr>
-        <w:t xml:space="preserve"> </w:t>
-      </w:r>
-      <w:proofErr w:type="spellStart"/>
-      <w:r>
-        <w:rPr>
-          <w:b/>
-          <w:bCs/>
-          <w:sz w:val="32"/>
-          <w:szCs w:val="32"/>
-          <w:u w:val="single"/>
-        </w:rPr>
-        <w:t>Paatam</w:t>
-      </w:r>
-      <w:proofErr w:type="spellEnd"/>
-      <w:r>
-        <w:rPr>
-          <w:b/>
-          <w:bCs/>
-          <w:sz w:val="32"/>
-          <w:szCs w:val="32"/>
-          <w:u w:val="single"/>
-        </w:rPr>
-        <w:t xml:space="preserve"> – TS </w:t>
-      </w:r>
-      <w:r>
-        <w:rPr>
-          <w:b/>
-          <w:bCs/>
-          <w:sz w:val="32"/>
-          <w:szCs w:val="32"/>
-          <w:u w:val="single"/>
-        </w:rPr>
-        <w:t>3.3</w:t>
-      </w:r>
-      <w:r>
-        <w:rPr>
-          <w:b/>
-          <w:bCs/>
-          <w:sz w:val="32"/>
-          <w:szCs w:val="32"/>
-          <w:u w:val="single"/>
-        </w:rPr>
-        <w:t xml:space="preserve"> </w:t>
-      </w:r>
-      <w:r>
-        <w:rPr>
-          <w:b/>
-          <w:bCs/>
-          <w:sz w:val="32"/>
-          <w:szCs w:val="32"/>
-          <w:u w:val="single"/>
-        </w:rPr>
-        <w:t>Sanskrit</w:t>
-      </w:r>
-      <w:r>
-        <w:rPr>
-          <w:b/>
-          <w:bCs/>
-          <w:sz w:val="32"/>
-          <w:szCs w:val="32"/>
-          <w:u w:val="single"/>
-        </w:rPr>
-        <w:t xml:space="preserve"> Corrections –</w:t>
-      </w:r>
-      <w:r>
-        <w:rPr>
-          <w:b/>
-          <w:bCs/>
-          <w:sz w:val="32"/>
-          <w:szCs w:val="32"/>
-          <w:u w:val="single"/>
-        </w:rPr>
-        <w:t xml:space="preserve"> </w:t>
-      </w:r>
-      <w:r>
-        <w:rPr>
-          <w:b/>
-          <w:bCs/>
-          <w:sz w:val="32"/>
-          <w:szCs w:val="32"/>
-          <w:u w:val="single"/>
-        </w:rPr>
-        <w:t xml:space="preserve">Observed till </w:t>
-      </w:r>
-      <w:r>
-        <w:rPr>
-          <w:b/>
-          <w:bCs/>
-          <w:sz w:val="32"/>
-          <w:szCs w:val="32"/>
-          <w:u w:val="single"/>
-        </w:rPr>
-        <w:t>31st August 2022</w:t>
-      </w:r>
     </w:p>
     <w:p>
       <w:pPr>
         <w:spacing w:before="0" w:line="240" w:lineRule="auto"/>
         <w:jc w:val="center"/>
         <w:rPr>
-          <w:bCs/>
-          <w:sz w:val="32"/>
-          <w:szCs w:val="32"/>
+          <w:b/>
+          <w:szCs w:val="24"/>
         </w:rPr>
       </w:pPr>
       <w:r>
         <w:rPr>
-          <w:bCs/>
-          <w:sz w:val="32"/>
-          <w:szCs w:val="32"/>
+          <w:b/>
+          <w:szCs w:val="24"/>
         </w:rPr>
         <w:t>(ignore those which are already incorporated in your book’s version and date)</w:t>
       </w:r>
@@ -187,12 +165,16 @@
               <w:spacing w:before="0" w:line="240" w:lineRule="auto"/>
               <w:jc w:val="center"/>
               <w:rPr>
+                <w:b/>
+                <w:bCs/>
                 <w:sz w:val="32"/>
                 <w:szCs w:val="32"/>
               </w:rPr>
             </w:pPr>
             <w:r>
               <w:rPr>
+                <w:b/>
+                <w:bCs/>
                 <w:sz w:val="32"/>
                 <w:szCs w:val="32"/>
               </w:rPr>
@@ -204,12 +186,16 @@
               <w:spacing w:before="0" w:line="240" w:lineRule="auto"/>
               <w:jc w:val="center"/>
               <w:rPr>
+                <w:b/>
+                <w:bCs/>
                 <w:sz w:val="32"/>
                 <w:szCs w:val="32"/>
               </w:rPr>
             </w:pPr>
             <w:r>
               <w:rPr>
+                <w:b/>
+                <w:bCs/>
                 <w:sz w:val="32"/>
                 <w:szCs w:val="32"/>
               </w:rPr>
@@ -226,12 +212,16 @@
               <w:spacing w:before="0" w:line="240" w:lineRule="auto"/>
               <w:jc w:val="center"/>
               <w:rPr>
+                <w:b/>
+                <w:bCs/>
                 <w:sz w:val="32"/>
                 <w:szCs w:val="32"/>
               </w:rPr>
             </w:pPr>
             <w:r>
               <w:rPr>
+                <w:b/>
+                <w:bCs/>
                 <w:sz w:val="32"/>
                 <w:szCs w:val="32"/>
               </w:rPr>
@@ -249,12 +239,16 @@
               <w:ind w:right="-18"/>
               <w:jc w:val="center"/>
               <w:rPr>
+                <w:b/>
+                <w:bCs/>
                 <w:sz w:val="32"/>
                 <w:szCs w:val="32"/>
               </w:rPr>
             </w:pPr>
             <w:r>
               <w:rPr>
+                <w:b/>
+                <w:bCs/>
                 <w:sz w:val="32"/>
                 <w:szCs w:val="32"/>
               </w:rPr>
@@ -300,7 +294,728 @@
         <w:tc>
           <w:tcPr>
             <w:tcW w:w="4048" w:type="dxa"/>
-            <w:shd w:val="clear" w:color="auto" w:fill="auto"/>
+          </w:tcPr>
+          <w:p>
+            <w:pPr>
+              <w:widowControl w:val="0"/>
+              <w:tabs>
+                <w:tab w:val="left" w:pos="993"/>
+              </w:tabs>
+              <w:autoSpaceDE w:val="0"/>
+              <w:autoSpaceDN w:val="0"/>
+              <w:adjustRightInd w:val="0"/>
+              <w:spacing w:before="0" w:line="252" w:lineRule="auto"/>
+              <w:ind w:right="297"/>
+              <w:rPr>
+                <w:rFonts w:cs="Arial"/>
+                <w:b/>
+                <w:sz w:val="28"/>
+                <w:szCs w:val="32"/>
+              </w:rPr>
+            </w:pPr>
+            <w:r>
+              <w:rPr>
+                <w:rFonts w:cs="Arial"/>
+                <w:b/>
+                <w:sz w:val="28"/>
+                <w:szCs w:val="32"/>
+              </w:rPr>
+              <w:t>T.S.3.3.</w:t>
+            </w:r>
+            <w:r>
+              <w:rPr>
+                <w:rFonts w:cs="Arial"/>
+                <w:b/>
+                <w:sz w:val="28"/>
+                <w:szCs w:val="32"/>
+              </w:rPr>
+              <w:t>8.5</w:t>
+            </w:r>
+            <w:r>
+              <w:rPr>
+                <w:rFonts w:cs="Arial"/>
+                <w:b/>
+                <w:sz w:val="28"/>
+                <w:szCs w:val="32"/>
+              </w:rPr>
+              <w:t xml:space="preserve"> – Kramam</w:t>
+            </w:r>
+          </w:p>
+          <w:p>
+            <w:pPr>
+              <w:widowControl w:val="0"/>
+              <w:tabs>
+                <w:tab w:val="left" w:pos="993"/>
+              </w:tabs>
+              <w:autoSpaceDE w:val="0"/>
+              <w:autoSpaceDN w:val="0"/>
+              <w:adjustRightInd w:val="0"/>
+              <w:spacing w:before="0" w:line="252" w:lineRule="auto"/>
+              <w:ind w:right="297"/>
+              <w:rPr>
+                <w:rFonts w:cs="Arial"/>
+                <w:b/>
+                <w:sz w:val="28"/>
+                <w:szCs w:val="32"/>
+              </w:rPr>
+            </w:pPr>
+            <w:r>
+              <w:rPr>
+                <w:rFonts w:cs="Arial"/>
+                <w:b/>
+                <w:sz w:val="28"/>
+                <w:szCs w:val="32"/>
+              </w:rPr>
+              <w:t xml:space="preserve">Krama Vaakyam No. - </w:t>
+            </w:r>
+            <w:r>
+              <w:rPr>
+                <w:rFonts w:cs="Arial"/>
+                <w:b/>
+                <w:sz w:val="28"/>
+                <w:szCs w:val="32"/>
+              </w:rPr>
+              <w:t>24</w:t>
+            </w:r>
+          </w:p>
+          <w:p>
+            <w:pPr>
+              <w:widowControl w:val="0"/>
+              <w:autoSpaceDE w:val="0"/>
+              <w:autoSpaceDN w:val="0"/>
+              <w:adjustRightInd w:val="0"/>
+              <w:spacing w:before="0" w:line="240" w:lineRule="auto"/>
+              <w:rPr>
+                <w:rFonts w:cs="Arial"/>
+                <w:bCs/>
+                <w:sz w:val="36"/>
+                <w:szCs w:val="36"/>
+                <w:lang w:bidi="ml-IN"/>
+              </w:rPr>
+            </w:pPr>
+            <w:r>
+              <w:rPr>
+                <w:rFonts w:cs="Arial"/>
+                <w:b/>
+                <w:sz w:val="28"/>
+                <w:szCs w:val="32"/>
+              </w:rPr>
+              <w:t>Panchaati No</w:t>
+            </w:r>
+            <w:r>
+              <w:rPr>
+                <w:rFonts w:cs="Arial"/>
+                <w:b/>
+                <w:szCs w:val="32"/>
+              </w:rPr>
+              <w:t>. -</w:t>
+            </w:r>
+            <w:r>
+              <w:rPr>
+                <w:rFonts w:cs="Arial"/>
+                <w:b/>
+                <w:sz w:val="28"/>
+                <w:szCs w:val="28"/>
+              </w:rPr>
+              <w:t xml:space="preserve"> 26</w:t>
+            </w:r>
+          </w:p>
+        </w:tc>
+        <w:tc>
+          <w:tcPr>
+            <w:tcW w:w="4819" w:type="dxa"/>
+          </w:tcPr>
+          <w:p>
+            <w:pPr>
+              <w:widowControl w:val="0"/>
+              <w:autoSpaceDE w:val="0"/>
+              <w:autoSpaceDN w:val="0"/>
+              <w:adjustRightInd w:val="0"/>
+              <w:spacing w:before="0" w:line="240" w:lineRule="auto"/>
+              <w:rPr>
+                <w:rFonts w:ascii="BRH Devanagari Extra" w:hAnsi="BRH Devanagari Extra" w:cs="BRH Devanagari Extra"/>
+                <w:color w:val="000000"/>
+                <w:sz w:val="36"/>
+                <w:szCs w:val="40"/>
+                <w:lang w:bidi="ml-IN"/>
+              </w:rPr>
+            </w:pPr>
+            <w:r>
+              <w:rPr>
+                <w:rFonts w:ascii="BRH Devanagari Extra" w:hAnsi="BRH Devanagari Extra" w:cs="BRH Devanagari Extra"/>
+                <w:color w:val="000000"/>
+                <w:sz w:val="40"/>
+                <w:szCs w:val="40"/>
+              </w:rPr>
+              <w:t>E</w:t>
+            </w:r>
+            <w:r>
+              <w:rPr>
+                <w:rFonts w:ascii="BRH Malayalam Extra" w:hAnsi="BRH Malayalam Extra" w:cs="BRH Devanagari Extra"/>
+                <w:b/>
+                <w:color w:val="000000"/>
+                <w:sz w:val="32"/>
+                <w:szCs w:val="40"/>
+              </w:rPr>
+              <w:t>–</w:t>
+            </w:r>
+            <w:r>
+              <w:rPr>
+                <w:rFonts w:ascii="BRH Devanagari Extra" w:hAnsi="BRH Devanagari Extra" w:cs="BRH Devanagari Extra"/>
+                <w:color w:val="000000"/>
+                <w:sz w:val="40"/>
+                <w:szCs w:val="40"/>
+              </w:rPr>
+              <w:t>mÉ</w:t>
+            </w:r>
+            <w:r>
+              <w:rPr>
+                <w:rFonts w:ascii="BRH Malayalam Extra" w:hAnsi="BRH Malayalam Extra" w:cs="BRH Devanagari Extra"/>
+                <w:b/>
+                <w:color w:val="000000"/>
+                <w:sz w:val="32"/>
+                <w:szCs w:val="40"/>
+              </w:rPr>
+              <w:t>–</w:t>
+            </w:r>
+            <w:proofErr w:type="spellStart"/>
+            <w:r>
+              <w:rPr>
+                <w:rFonts w:ascii="BRH Devanagari Extra" w:hAnsi="BRH Devanagari Extra" w:cs="BRH Devanagari Extra"/>
+                <w:color w:val="000000"/>
+                <w:sz w:val="40"/>
+                <w:szCs w:val="40"/>
+              </w:rPr>
+              <w:t>Sì</w:t>
+            </w:r>
+            <w:proofErr w:type="spellEnd"/>
+            <w:r>
+              <w:rPr>
+                <w:rFonts w:ascii="BRH Malayalam Extra" w:hAnsi="BRH Malayalam Extra" w:cs="BRH Devanagari Extra"/>
+                <w:b/>
+                <w:color w:val="000000"/>
+                <w:sz w:val="32"/>
+                <w:szCs w:val="40"/>
+              </w:rPr>
+              <w:t>–</w:t>
+            </w:r>
+            <w:r>
+              <w:rPr>
+                <w:rFonts w:ascii="BRH Devanagari Extra" w:hAnsi="BRH Devanagari Extra" w:cs="BRH Devanagari Extra"/>
+                <w:color w:val="000000"/>
+                <w:sz w:val="40"/>
+                <w:szCs w:val="40"/>
+              </w:rPr>
+              <w:t>¹ÉUþqÉÑmÉ´ÉÉå</w:t>
+            </w:r>
+            <w:r>
+              <w:rPr>
+                <w:rFonts w:ascii="BRH Malayalam Extra" w:hAnsi="BRH Malayalam Extra" w:cs="BRH Devanagari Extra"/>
+                <w:b/>
+                <w:color w:val="000000"/>
+                <w:sz w:val="32"/>
+                <w:szCs w:val="40"/>
+              </w:rPr>
+              <w:t>–</w:t>
+            </w:r>
+            <w:proofErr w:type="spellStart"/>
+            <w:r>
+              <w:rPr>
+                <w:rFonts w:ascii="BRH Devanagari Extra" w:hAnsi="BRH Devanagari Extra" w:cs="BRH Devanagari Extra"/>
+                <w:color w:val="000000"/>
+                <w:sz w:val="40"/>
+                <w:szCs w:val="40"/>
+              </w:rPr>
+              <w:t>i</w:t>
+            </w:r>
+            <w:r>
+              <w:rPr>
+                <w:rFonts w:ascii="BRH Devanagari Extra" w:hAnsi="BRH Devanagari Extra" w:cs="BRH Devanagari Extra"/>
+                <w:color w:val="000000"/>
+                <w:sz w:val="40"/>
+                <w:szCs w:val="40"/>
+                <w:highlight w:val="yellow"/>
+              </w:rPr>
+              <w:t>ÉÉUþqÉç</w:t>
+            </w:r>
+            <w:proofErr w:type="spellEnd"/>
+            <w:r>
+              <w:rPr>
+                <w:rFonts w:ascii="BRH Devanagari Extra" w:hAnsi="BRH Devanagari Extra" w:cs="BRH Devanagari Extra"/>
+                <w:color w:val="000000"/>
+                <w:sz w:val="40"/>
+                <w:szCs w:val="40"/>
+              </w:rPr>
+              <w:t xml:space="preserve"> |</w:t>
+            </w:r>
+          </w:p>
+        </w:tc>
+        <w:tc>
+          <w:tcPr>
+            <w:tcW w:w="5103" w:type="dxa"/>
+          </w:tcPr>
+          <w:p>
+            <w:pPr>
+              <w:widowControl w:val="0"/>
+              <w:autoSpaceDE w:val="0"/>
+              <w:autoSpaceDN w:val="0"/>
+              <w:adjustRightInd w:val="0"/>
+              <w:spacing w:before="0" w:line="240" w:lineRule="auto"/>
+              <w:rPr>
+                <w:rFonts w:ascii="BRH Devanagari Extra" w:hAnsi="BRH Devanagari Extra" w:cs="BRH Devanagari Extra"/>
+                <w:color w:val="000000"/>
+                <w:sz w:val="36"/>
+                <w:szCs w:val="40"/>
+                <w:lang w:bidi="ml-IN"/>
+              </w:rPr>
+            </w:pPr>
+            <w:r>
+              <w:rPr>
+                <w:rFonts w:ascii="BRH Devanagari Extra" w:hAnsi="BRH Devanagari Extra" w:cs="BRH Devanagari Extra"/>
+                <w:color w:val="000000"/>
+                <w:sz w:val="40"/>
+                <w:szCs w:val="40"/>
+              </w:rPr>
+              <w:t>E</w:t>
+            </w:r>
+            <w:r>
+              <w:rPr>
+                <w:rFonts w:ascii="BRH Malayalam Extra" w:hAnsi="BRH Malayalam Extra" w:cs="BRH Devanagari Extra"/>
+                <w:b/>
+                <w:color w:val="000000"/>
+                <w:sz w:val="32"/>
+                <w:szCs w:val="40"/>
+              </w:rPr>
+              <w:t>–</w:t>
+            </w:r>
+            <w:r>
+              <w:rPr>
+                <w:rFonts w:ascii="BRH Devanagari Extra" w:hAnsi="BRH Devanagari Extra" w:cs="BRH Devanagari Extra"/>
+                <w:color w:val="000000"/>
+                <w:sz w:val="40"/>
+                <w:szCs w:val="40"/>
+              </w:rPr>
+              <w:t>mÉ</w:t>
+            </w:r>
+            <w:r>
+              <w:rPr>
+                <w:rFonts w:ascii="BRH Malayalam Extra" w:hAnsi="BRH Malayalam Extra" w:cs="BRH Devanagari Extra"/>
+                <w:b/>
+                <w:color w:val="000000"/>
+                <w:sz w:val="32"/>
+                <w:szCs w:val="40"/>
+              </w:rPr>
+              <w:t>–</w:t>
+            </w:r>
+            <w:proofErr w:type="spellStart"/>
+            <w:r>
+              <w:rPr>
+                <w:rFonts w:ascii="BRH Devanagari Extra" w:hAnsi="BRH Devanagari Extra" w:cs="BRH Devanagari Extra"/>
+                <w:color w:val="000000"/>
+                <w:sz w:val="40"/>
+                <w:szCs w:val="40"/>
+              </w:rPr>
+              <w:t>Sì</w:t>
+            </w:r>
+            <w:proofErr w:type="spellEnd"/>
+            <w:r>
+              <w:rPr>
+                <w:rFonts w:ascii="BRH Malayalam Extra" w:hAnsi="BRH Malayalam Extra" w:cs="BRH Devanagari Extra"/>
+                <w:b/>
+                <w:color w:val="000000"/>
+                <w:sz w:val="32"/>
+                <w:szCs w:val="40"/>
+              </w:rPr>
+              <w:t>–</w:t>
+            </w:r>
+            <w:r>
+              <w:rPr>
+                <w:rFonts w:ascii="BRH Devanagari Extra" w:hAnsi="BRH Devanagari Extra" w:cs="BRH Devanagari Extra"/>
+                <w:color w:val="000000"/>
+                <w:sz w:val="40"/>
+                <w:szCs w:val="40"/>
+              </w:rPr>
+              <w:t>¹ÉUþqÉÑmÉ´ÉÉå</w:t>
+            </w:r>
+            <w:r>
+              <w:rPr>
+                <w:rFonts w:ascii="BRH Malayalam Extra" w:hAnsi="BRH Malayalam Extra" w:cs="BRH Devanagari Extra"/>
+                <w:b/>
+                <w:color w:val="000000"/>
+                <w:sz w:val="32"/>
+                <w:szCs w:val="40"/>
+              </w:rPr>
+              <w:t>–</w:t>
+            </w:r>
+            <w:proofErr w:type="spellStart"/>
+            <w:r>
+              <w:rPr>
+                <w:rFonts w:ascii="BRH Devanagari Extra" w:hAnsi="BRH Devanagari Extra" w:cs="BRH Devanagari Extra"/>
+                <w:color w:val="000000"/>
+                <w:sz w:val="40"/>
+                <w:szCs w:val="40"/>
+              </w:rPr>
+              <w:t>iÉ</w:t>
+            </w:r>
+            <w:r>
+              <w:rPr>
+                <w:rFonts w:ascii="BRH Devanagari Extra" w:hAnsi="BRH Devanagari Extra" w:cs="BRH Devanagari Extra"/>
+                <w:color w:val="000000"/>
+                <w:sz w:val="40"/>
+                <w:szCs w:val="40"/>
+                <w:highlight w:val="green"/>
+              </w:rPr>
+              <w:t>ÉUÿq</w:t>
+            </w:r>
+            <w:r>
+              <w:rPr>
+                <w:rFonts w:ascii="BRH Devanagari Extra" w:hAnsi="BRH Devanagari Extra" w:cs="BRH Devanagari Extra"/>
+                <w:color w:val="000000"/>
+                <w:sz w:val="40"/>
+                <w:szCs w:val="40"/>
+              </w:rPr>
+              <w:t>Éç</w:t>
+            </w:r>
+            <w:proofErr w:type="spellEnd"/>
+            <w:r>
+              <w:rPr>
+                <w:rFonts w:ascii="BRH Devanagari Extra" w:hAnsi="BRH Devanagari Extra" w:cs="BRH Devanagari Extra"/>
+                <w:color w:val="000000"/>
+                <w:sz w:val="40"/>
+                <w:szCs w:val="40"/>
+              </w:rPr>
+              <w:t xml:space="preserve"> |</w:t>
+            </w:r>
+          </w:p>
+        </w:tc>
+      </w:tr>
+    </w:tbl>
+    <w:p>
+      <w:pPr>
+        <w:spacing w:before="0" w:line="240" w:lineRule="auto"/>
+        <w:jc w:val="center"/>
+        <w:rPr>
+          <w:b/>
+          <w:bCs/>
+          <w:sz w:val="32"/>
+          <w:szCs w:val="32"/>
+          <w:u w:val="single"/>
+        </w:rPr>
+      </w:pPr>
+      <w:r>
+        <w:rPr>
+          <w:b/>
+          <w:bCs/>
+          <w:sz w:val="32"/>
+          <w:szCs w:val="32"/>
+          <w:u w:val="single"/>
+        </w:rPr>
+        <w:t>==================</w:t>
+      </w:r>
+    </w:p>
+    <w:p>
+      <w:pPr>
+        <w:spacing w:before="0" w:line="240" w:lineRule="auto"/>
+        <w:jc w:val="center"/>
+        <w:rPr>
+          <w:b/>
+          <w:bCs/>
+          <w:sz w:val="32"/>
+          <w:szCs w:val="32"/>
+          <w:u w:val="single"/>
+        </w:rPr>
+      </w:pPr>
+    </w:p>
+    <w:p>
+      <w:pPr>
+        <w:spacing w:before="0" w:line="240" w:lineRule="auto"/>
+        <w:jc w:val="center"/>
+        <w:rPr>
+          <w:b/>
+          <w:bCs/>
+          <w:sz w:val="32"/>
+          <w:szCs w:val="32"/>
+          <w:u w:val="single"/>
+        </w:rPr>
+      </w:pPr>
+      <w:r>
+        <w:rPr>
+          <w:b/>
+          <w:bCs/>
+          <w:sz w:val="32"/>
+          <w:szCs w:val="32"/>
+          <w:u w:val="single"/>
+        </w:rPr>
+        <w:t xml:space="preserve">TS </w:t>
+      </w:r>
+      <w:r>
+        <w:rPr>
+          <w:b/>
+          <w:bCs/>
+          <w:sz w:val="32"/>
+          <w:szCs w:val="32"/>
+          <w:u w:val="single"/>
+        </w:rPr>
+        <w:t>Krama</w:t>
+      </w:r>
+      <w:r>
+        <w:rPr>
+          <w:b/>
+          <w:bCs/>
+          <w:sz w:val="32"/>
+          <w:szCs w:val="32"/>
+          <w:u w:val="single"/>
+        </w:rPr>
+        <w:t xml:space="preserve"> Paatam – TS </w:t>
+      </w:r>
+      <w:r>
+        <w:rPr>
+          <w:b/>
+          <w:bCs/>
+          <w:sz w:val="32"/>
+          <w:szCs w:val="32"/>
+          <w:u w:val="single"/>
+        </w:rPr>
+        <w:t>3.3</w:t>
+      </w:r>
+      <w:r>
+        <w:rPr>
+          <w:b/>
+          <w:bCs/>
+          <w:sz w:val="32"/>
+          <w:szCs w:val="32"/>
+          <w:u w:val="single"/>
+        </w:rPr>
+        <w:t xml:space="preserve"> </w:t>
+      </w:r>
+      <w:r>
+        <w:rPr>
+          <w:b/>
+          <w:bCs/>
+          <w:sz w:val="32"/>
+          <w:szCs w:val="32"/>
+          <w:u w:val="single"/>
+        </w:rPr>
+        <w:t>Sanskrit</w:t>
+      </w:r>
+      <w:r>
+        <w:rPr>
+          <w:b/>
+          <w:bCs/>
+          <w:sz w:val="32"/>
+          <w:szCs w:val="32"/>
+          <w:u w:val="single"/>
+        </w:rPr>
+        <w:t xml:space="preserve"> Corrections –</w:t>
+      </w:r>
+      <w:r>
+        <w:rPr>
+          <w:b/>
+          <w:bCs/>
+          <w:sz w:val="32"/>
+          <w:szCs w:val="32"/>
+          <w:u w:val="single"/>
+        </w:rPr>
+        <w:t xml:space="preserve"> </w:t>
+      </w:r>
+      <w:r>
+        <w:rPr>
+          <w:b/>
+          <w:bCs/>
+          <w:sz w:val="32"/>
+          <w:szCs w:val="32"/>
+          <w:u w:val="single"/>
+        </w:rPr>
+        <w:t xml:space="preserve">Observed till </w:t>
+      </w:r>
+      <w:r>
+        <w:rPr>
+          <w:b/>
+          <w:bCs/>
+          <w:sz w:val="32"/>
+          <w:szCs w:val="32"/>
+          <w:u w:val="single"/>
+        </w:rPr>
+        <w:t>31st August 2022</w:t>
+      </w:r>
+    </w:p>
+    <w:p>
+      <w:pPr>
+        <w:spacing w:before="0" w:line="240" w:lineRule="auto"/>
+        <w:jc w:val="center"/>
+        <w:rPr>
+          <w:bCs/>
+          <w:sz w:val="32"/>
+          <w:szCs w:val="32"/>
+        </w:rPr>
+      </w:pPr>
+      <w:r>
+        <w:rPr>
+          <w:bCs/>
+          <w:sz w:val="32"/>
+          <w:szCs w:val="32"/>
+        </w:rPr>
+        <w:t>(ignore those which are already incorporated in your book’s version and date)</w:t>
+      </w:r>
+    </w:p>
+    <w:tbl>
+      <w:tblPr>
+        <w:tblW w:w="13970" w:type="dxa"/>
+        <w:tblInd w:w="-792" w:type="dxa"/>
+        <w:tblBorders>
+          <w:top w:val="single" w:sz="4" w:space="0" w:color="000000"/>
+          <w:left w:val="single" w:sz="4" w:space="0" w:color="000000"/>
+          <w:bottom w:val="single" w:sz="4" w:space="0" w:color="000000"/>
+          <w:right w:val="single" w:sz="4" w:space="0" w:color="000000"/>
+          <w:insideH w:val="single" w:sz="4" w:space="0" w:color="000000"/>
+          <w:insideV w:val="single" w:sz="4" w:space="0" w:color="000000"/>
+        </w:tblBorders>
+        <w:tblLook w:val="04A0" w:firstRow="1" w:lastRow="0" w:firstColumn="1" w:lastColumn="0" w:noHBand="0" w:noVBand="1"/>
+      </w:tblPr>
+      <w:tblGrid>
+        <w:gridCol w:w="4048"/>
+        <w:gridCol w:w="4819"/>
+        <w:gridCol w:w="5103"/>
+      </w:tblGrid>
+      <w:tr>
+        <w:tc>
+          <w:tcPr>
+            <w:tcW w:w="4048" w:type="dxa"/>
+          </w:tcPr>
+          <w:p>
+            <w:pPr>
+              <w:spacing w:before="0" w:line="240" w:lineRule="auto"/>
+              <w:jc w:val="center"/>
+              <w:rPr>
+                <w:b/>
+                <w:bCs/>
+                <w:sz w:val="32"/>
+                <w:szCs w:val="32"/>
+              </w:rPr>
+            </w:pPr>
+            <w:r>
+              <w:rPr>
+                <w:b/>
+                <w:bCs/>
+                <w:sz w:val="32"/>
+                <w:szCs w:val="32"/>
+              </w:rPr>
+              <w:t>Section, Paragraph</w:t>
+            </w:r>
+          </w:p>
+          <w:p>
+            <w:pPr>
+              <w:spacing w:before="0" w:line="240" w:lineRule="auto"/>
+              <w:jc w:val="center"/>
+              <w:rPr>
+                <w:b/>
+                <w:bCs/>
+                <w:sz w:val="32"/>
+                <w:szCs w:val="32"/>
+              </w:rPr>
+            </w:pPr>
+            <w:r>
+              <w:rPr>
+                <w:b/>
+                <w:bCs/>
+                <w:sz w:val="32"/>
+                <w:szCs w:val="32"/>
+              </w:rPr>
+              <w:t>Reference</w:t>
+            </w:r>
+          </w:p>
+        </w:tc>
+        <w:tc>
+          <w:tcPr>
+            <w:tcW w:w="4819" w:type="dxa"/>
+          </w:tcPr>
+          <w:p>
+            <w:pPr>
+              <w:spacing w:before="0" w:line="240" w:lineRule="auto"/>
+              <w:jc w:val="center"/>
+              <w:rPr>
+                <w:b/>
+                <w:bCs/>
+                <w:sz w:val="32"/>
+                <w:szCs w:val="32"/>
+              </w:rPr>
+            </w:pPr>
+            <w:r>
+              <w:rPr>
+                <w:b/>
+                <w:bCs/>
+                <w:sz w:val="32"/>
+                <w:szCs w:val="32"/>
+              </w:rPr>
+              <w:t>As Printed</w:t>
+            </w:r>
+          </w:p>
+        </w:tc>
+        <w:tc>
+          <w:tcPr>
+            <w:tcW w:w="5103" w:type="dxa"/>
+          </w:tcPr>
+          <w:p>
+            <w:pPr>
+              <w:spacing w:before="0" w:line="240" w:lineRule="auto"/>
+              <w:ind w:right="-18"/>
+              <w:jc w:val="center"/>
+              <w:rPr>
+                <w:b/>
+                <w:bCs/>
+                <w:sz w:val="32"/>
+                <w:szCs w:val="32"/>
+              </w:rPr>
+            </w:pPr>
+            <w:r>
+              <w:rPr>
+                <w:b/>
+                <w:bCs/>
+                <w:sz w:val="32"/>
+                <w:szCs w:val="32"/>
+              </w:rPr>
+              <w:t>To be read as or corrected as</w:t>
+            </w:r>
+          </w:p>
+        </w:tc>
+      </w:tr>
+    </w:tbl>
+    <w:p>
+      <w:pPr>
+        <w:spacing w:before="0" w:line="240" w:lineRule="auto"/>
+        <w:rPr>
+          <w:vanish/>
+          <w:sz w:val="32"/>
+          <w:szCs w:val="32"/>
+        </w:rPr>
+      </w:pPr>
+    </w:p>
+    <w:tbl>
+      <w:tblPr>
+        <w:tblW w:w="13970" w:type="dxa"/>
+        <w:tblInd w:w="-792" w:type="dxa"/>
+        <w:tblBorders>
+          <w:top w:val="single" w:sz="4" w:space="0" w:color="000000"/>
+          <w:left w:val="single" w:sz="4" w:space="0" w:color="000000"/>
+          <w:bottom w:val="single" w:sz="4" w:space="0" w:color="000000"/>
+          <w:right w:val="single" w:sz="4" w:space="0" w:color="000000"/>
+          <w:insideH w:val="single" w:sz="4" w:space="0" w:color="000000"/>
+          <w:insideV w:val="single" w:sz="4" w:space="0" w:color="000000"/>
+        </w:tblBorders>
+        <w:tblLook w:val="04A0" w:firstRow="1" w:lastRow="0" w:firstColumn="1" w:lastColumn="0" w:noHBand="0" w:noVBand="1"/>
+      </w:tblPr>
+      <w:tblGrid>
+        <w:gridCol w:w="4048"/>
+        <w:gridCol w:w="4819"/>
+        <w:gridCol w:w="5103"/>
+      </w:tblGrid>
+      <w:tr>
+        <w:trPr>
+          <w:trHeight w:val="918"/>
+        </w:trPr>
+        <w:tc>
+          <w:tcPr>
+            <w:tcW w:w="4048" w:type="dxa"/>
           </w:tcPr>
           <w:p>
             <w:pPr>
@@ -333,7 +1048,6 @@
         <w:tc>
           <w:tcPr>
             <w:tcW w:w="4819" w:type="dxa"/>
-            <w:shd w:val="clear" w:color="auto" w:fill="auto"/>
           </w:tcPr>
           <w:p>
             <w:pPr>
@@ -366,7 +1080,6 @@
         <w:tc>
           <w:tcPr>
             <w:tcW w:w="5103" w:type="dxa"/>
-            <w:shd w:val="clear" w:color="auto" w:fill="auto"/>
           </w:tcPr>
           <w:p>
             <w:pPr>
@@ -400,6 +1113,9 @@
     </w:tbl>
     <w:p>
       <w:pPr>
+        <w:pBdr>
+          <w:bottom w:val="double" w:sz="6" w:space="1" w:color="auto"/>
+        </w:pBdr>
         <w:spacing w:before="0" w:line="240" w:lineRule="auto"/>
         <w:jc w:val="center"/>
         <w:rPr>
@@ -410,16 +1126,110 @@
           <w:u w:val="single"/>
         </w:rPr>
       </w:pPr>
-      <w:r>
-        <w:rPr>
-          <w:b/>
-          <w:bCs/>
-          <w:sz w:val="32"/>
-          <w:szCs w:val="32"/>
-          <w:u w:val="single"/>
-        </w:rPr>
-        <w:t>==================</w:t>
-      </w:r>
+    </w:p>
+    <w:p>
+      <w:pPr>
+        <w:spacing w:before="0" w:line="240" w:lineRule="auto"/>
+        <w:jc w:val="center"/>
+        <w:rPr>
+          <w:b/>
+          <w:bCs/>
+          <w:sz w:val="32"/>
+          <w:szCs w:val="32"/>
+          <w:u w:val="single"/>
+        </w:rPr>
+      </w:pPr>
+    </w:p>
+    <w:p>
+      <w:pPr>
+        <w:spacing w:before="0" w:line="240" w:lineRule="auto"/>
+        <w:jc w:val="center"/>
+        <w:rPr>
+          <w:b/>
+          <w:bCs/>
+          <w:sz w:val="32"/>
+          <w:szCs w:val="32"/>
+          <w:u w:val="single"/>
+        </w:rPr>
+      </w:pPr>
+    </w:p>
+    <w:p>
+      <w:pPr>
+        <w:spacing w:before="0" w:line="240" w:lineRule="auto"/>
+        <w:jc w:val="center"/>
+        <w:rPr>
+          <w:b/>
+          <w:bCs/>
+          <w:sz w:val="32"/>
+          <w:szCs w:val="32"/>
+          <w:u w:val="single"/>
+        </w:rPr>
+      </w:pPr>
+    </w:p>
+    <w:p>
+      <w:pPr>
+        <w:spacing w:before="0" w:line="240" w:lineRule="auto"/>
+        <w:jc w:val="center"/>
+        <w:rPr>
+          <w:b/>
+          <w:bCs/>
+          <w:sz w:val="32"/>
+          <w:szCs w:val="32"/>
+          <w:u w:val="single"/>
+        </w:rPr>
+      </w:pPr>
+    </w:p>
+    <w:p>
+      <w:pPr>
+        <w:spacing w:before="0" w:line="240" w:lineRule="auto"/>
+        <w:jc w:val="center"/>
+        <w:rPr>
+          <w:b/>
+          <w:bCs/>
+          <w:sz w:val="32"/>
+          <w:szCs w:val="32"/>
+          <w:u w:val="single"/>
+        </w:rPr>
+      </w:pPr>
+    </w:p>
+    <w:p>
+      <w:pPr>
+        <w:spacing w:before="0" w:line="240" w:lineRule="auto"/>
+        <w:jc w:val="center"/>
+        <w:rPr>
+          <w:b/>
+          <w:bCs/>
+          <w:sz w:val="32"/>
+          <w:szCs w:val="32"/>
+          <w:u w:val="single"/>
+        </w:rPr>
+      </w:pPr>
+    </w:p>
+    <w:p>
+      <w:pPr>
+        <w:spacing w:before="0" w:line="240" w:lineRule="auto"/>
+        <w:jc w:val="center"/>
+        <w:rPr>
+          <w:b/>
+          <w:bCs/>
+          <w:sz w:val="32"/>
+          <w:szCs w:val="32"/>
+          <w:u w:val="single"/>
+        </w:rPr>
+      </w:pPr>
+    </w:p>
+    <w:p>
+      <w:pPr>
+        <w:spacing w:before="0" w:line="240" w:lineRule="auto"/>
+        <w:jc w:val="center"/>
+        <w:rPr>
+          <w:b/>
+          <w:bCs/>
+          <w:sz w:val="32"/>
+          <w:szCs w:val="32"/>
+          <w:u w:val="single"/>
+        </w:rPr>
+      </w:pPr>
     </w:p>
     <w:p>
       <w:pPr>
@@ -440,9 +1250,9 @@
           <w:szCs w:val="32"/>
           <w:u w:val="single"/>
         </w:rPr>
+        <w:lastRenderedPageBreak/>
         <w:t xml:space="preserve">TS </w:t>
       </w:r>
-      <w:proofErr w:type="spellStart"/>
       <w:r>
         <w:rPr>
           <w:b/>
@@ -453,38 +1263,15 @@
         </w:rPr>
         <w:t>Krama</w:t>
       </w:r>
-      <w:proofErr w:type="spellEnd"/>
-      <w:r>
-        <w:rPr>
-          <w:b/>
-          <w:bCs/>
-          <w:sz w:val="32"/>
-          <w:szCs w:val="32"/>
-          <w:u w:val="single"/>
-        </w:rPr>
-        <w:t xml:space="preserve"> </w:t>
-      </w:r>
-      <w:proofErr w:type="spellStart"/>
-      <w:r>
-        <w:rPr>
-          <w:b/>
-          <w:bCs/>
-          <w:sz w:val="32"/>
-          <w:szCs w:val="32"/>
-          <w:u w:val="single"/>
-        </w:rPr>
-        <w:t>Paatam</w:t>
-      </w:r>
-      <w:proofErr w:type="spellEnd"/>
-      <w:r>
-        <w:rPr>
-          <w:b/>
-          <w:bCs/>
-          <w:sz w:val="32"/>
-          <w:szCs w:val="32"/>
-          <w:u w:val="single"/>
-        </w:rPr>
-        <w:t xml:space="preserve"> – TS </w:t>
+      <w:r>
+        <w:rPr>
+          <w:b/>
+          <w:bCs/>
+          <w:sz w:val="32"/>
+          <w:szCs w:val="32"/>
+          <w:u w:val="single"/>
+        </w:rPr>
+        <w:t xml:space="preserve"> Paatam – TS </w:t>
       </w:r>
       <w:r>
         <w:rPr>
@@ -613,12 +1400,16 @@
               <w:spacing w:before="0" w:line="240" w:lineRule="auto"/>
               <w:jc w:val="center"/>
               <w:rPr>
+                <w:b/>
+                <w:bCs/>
                 <w:sz w:val="32"/>
                 <w:szCs w:val="32"/>
               </w:rPr>
             </w:pPr>
             <w:r>
               <w:rPr>
+                <w:b/>
+                <w:bCs/>
                 <w:sz w:val="32"/>
                 <w:szCs w:val="32"/>
               </w:rPr>
@@ -630,12 +1421,16 @@
               <w:spacing w:before="0" w:line="240" w:lineRule="auto"/>
               <w:jc w:val="center"/>
               <w:rPr>
+                <w:b/>
+                <w:bCs/>
                 <w:sz w:val="32"/>
                 <w:szCs w:val="32"/>
               </w:rPr>
             </w:pPr>
             <w:r>
               <w:rPr>
+                <w:b/>
+                <w:bCs/>
                 <w:sz w:val="32"/>
                 <w:szCs w:val="32"/>
               </w:rPr>
@@ -652,12 +1447,16 @@
               <w:spacing w:before="0" w:line="240" w:lineRule="auto"/>
               <w:jc w:val="center"/>
               <w:rPr>
+                <w:b/>
+                <w:bCs/>
                 <w:sz w:val="32"/>
                 <w:szCs w:val="32"/>
               </w:rPr>
             </w:pPr>
             <w:r>
               <w:rPr>
+                <w:b/>
+                <w:bCs/>
                 <w:sz w:val="32"/>
                 <w:szCs w:val="32"/>
               </w:rPr>
@@ -675,12 +1474,16 @@
               <w:ind w:right="-18"/>
               <w:jc w:val="center"/>
               <w:rPr>
+                <w:b/>
+                <w:bCs/>
                 <w:sz w:val="32"/>
                 <w:szCs w:val="32"/>
               </w:rPr>
             </w:pPr>
             <w:r>
               <w:rPr>
+                <w:b/>
+                <w:bCs/>
                 <w:sz w:val="32"/>
                 <w:szCs w:val="32"/>
               </w:rPr>
@@ -744,20 +1547,8 @@
                 <w:sz w:val="28"/>
                 <w:szCs w:val="32"/>
               </w:rPr>
-              <w:t xml:space="preserve">– </w:t>
-            </w:r>
-            <w:proofErr w:type="spellStart"/>
-            <w:r>
-              <w:rPr>
-                <w:rFonts w:cs="Arial"/>
-                <w:b/>
-                <w:color w:val="000000"/>
-                <w:sz w:val="28"/>
-                <w:szCs w:val="32"/>
-              </w:rPr>
-              <w:t>Kramam</w:t>
-            </w:r>
-            <w:proofErr w:type="spellEnd"/>
+              <w:t>– Kramam</w:t>
+            </w:r>
           </w:p>
           <w:p>
             <w:pPr>
@@ -778,7 +1569,6 @@
                 <w:szCs w:val="32"/>
               </w:rPr>
             </w:pPr>
-            <w:proofErr w:type="spellStart"/>
             <w:r>
               <w:rPr>
                 <w:rFonts w:cs="Arial"/>
@@ -787,40 +1577,7 @@
                 <w:sz w:val="28"/>
                 <w:szCs w:val="32"/>
               </w:rPr>
-              <w:t>Krama</w:t>
-            </w:r>
-            <w:proofErr w:type="spellEnd"/>
-            <w:r>
-              <w:rPr>
-                <w:rFonts w:cs="Arial"/>
-                <w:b/>
-                <w:color w:val="000000"/>
-                <w:sz w:val="28"/>
-                <w:szCs w:val="32"/>
-              </w:rPr>
-              <w:t xml:space="preserve"> </w:t>
-            </w:r>
-            <w:proofErr w:type="spellStart"/>
-            <w:r>
-              <w:rPr>
-                <w:rFonts w:cs="Arial"/>
-                <w:b/>
-                <w:color w:val="000000"/>
-                <w:sz w:val="28"/>
-                <w:szCs w:val="32"/>
-              </w:rPr>
-              <w:t>Vaakyam</w:t>
-            </w:r>
-            <w:proofErr w:type="spellEnd"/>
-            <w:r>
-              <w:rPr>
-                <w:rFonts w:cs="Arial"/>
-                <w:b/>
-                <w:color w:val="000000"/>
-                <w:sz w:val="28"/>
-                <w:szCs w:val="32"/>
-              </w:rPr>
-              <w:t xml:space="preserve"> No. - </w:t>
+              <w:t xml:space="preserve">Krama Vaakyam No. - </w:t>
             </w:r>
             <w:r>
               <w:rPr>
@@ -852,7 +1609,6 @@
                 <w:szCs w:val="32"/>
               </w:rPr>
             </w:pPr>
-            <w:proofErr w:type="spellStart"/>
             <w:r>
               <w:rPr>
                 <w:rFonts w:cs="Arial"/>
@@ -861,18 +1617,7 @@
                 <w:sz w:val="28"/>
                 <w:szCs w:val="32"/>
               </w:rPr>
-              <w:t>Panchaati</w:t>
-            </w:r>
-            <w:proofErr w:type="spellEnd"/>
-            <w:r>
-              <w:rPr>
-                <w:rFonts w:cs="Arial"/>
-                <w:b/>
-                <w:color w:val="000000"/>
-                <w:sz w:val="28"/>
-                <w:szCs w:val="32"/>
-              </w:rPr>
-              <w:t xml:space="preserve"> No</w:t>
+              <w:t>Panchaati No</w:t>
             </w:r>
             <w:r>
               <w:rPr>
@@ -932,6 +1677,7 @@
               </w:rPr>
               <w:t>AÉrÉÑþ</w:t>
             </w:r>
+            <w:proofErr w:type="spellEnd"/>
             <w:r>
               <w:rPr>
                 <w:rFonts w:ascii="BRH Devanagari Extra" w:eastAsia="Times New Roman" w:hAnsi="BRH Devanagari Extra" w:cs="BRH Devanagari Extra"/>
@@ -943,7 +1689,6 @@
               </w:rPr>
               <w:t>Uç</w:t>
             </w:r>
-            <w:proofErr w:type="spellEnd"/>
             <w:r>
               <w:rPr>
                 <w:rFonts w:ascii="BRH Devanagari Extra" w:hAnsi="BRH Devanagari Extra" w:cs="BRH Devanagari Extra"/>
@@ -1252,20 +1997,8 @@
                 <w:sz w:val="28"/>
                 <w:szCs w:val="32"/>
               </w:rPr>
-              <w:t xml:space="preserve">– </w:t>
-            </w:r>
-            <w:proofErr w:type="spellStart"/>
-            <w:r>
-              <w:rPr>
-                <w:rFonts w:cs="Arial"/>
-                <w:b/>
-                <w:color w:val="000000"/>
-                <w:sz w:val="28"/>
-                <w:szCs w:val="32"/>
-              </w:rPr>
-              <w:t>Kramam</w:t>
-            </w:r>
-            <w:proofErr w:type="spellEnd"/>
+              <w:t>– Kramam</w:t>
+            </w:r>
           </w:p>
           <w:p>
             <w:pPr>
@@ -1286,7 +2019,6 @@
                 <w:szCs w:val="32"/>
               </w:rPr>
             </w:pPr>
-            <w:proofErr w:type="spellStart"/>
             <w:r>
               <w:rPr>
                 <w:rFonts w:cs="Arial"/>
@@ -1295,40 +2027,7 @@
                 <w:sz w:val="28"/>
                 <w:szCs w:val="32"/>
               </w:rPr>
-              <w:t>Krama</w:t>
-            </w:r>
-            <w:proofErr w:type="spellEnd"/>
-            <w:r>
-              <w:rPr>
-                <w:rFonts w:cs="Arial"/>
-                <w:b/>
-                <w:color w:val="000000"/>
-                <w:sz w:val="28"/>
-                <w:szCs w:val="32"/>
-              </w:rPr>
-              <w:t xml:space="preserve"> </w:t>
-            </w:r>
-            <w:proofErr w:type="spellStart"/>
-            <w:r>
-              <w:rPr>
-                <w:rFonts w:cs="Arial"/>
-                <w:b/>
-                <w:color w:val="000000"/>
-                <w:sz w:val="28"/>
-                <w:szCs w:val="32"/>
-              </w:rPr>
-              <w:t>Vaakyam</w:t>
-            </w:r>
-            <w:proofErr w:type="spellEnd"/>
-            <w:r>
-              <w:rPr>
-                <w:rFonts w:cs="Arial"/>
-                <w:b/>
-                <w:color w:val="000000"/>
-                <w:sz w:val="28"/>
-                <w:szCs w:val="32"/>
-              </w:rPr>
-              <w:t xml:space="preserve"> No. - </w:t>
+              <w:t xml:space="preserve">Krama Vaakyam No. - </w:t>
             </w:r>
             <w:r>
               <w:rPr>
@@ -1370,7 +2069,6 @@
                 <w:szCs w:val="32"/>
               </w:rPr>
             </w:pPr>
-            <w:proofErr w:type="spellStart"/>
             <w:r>
               <w:rPr>
                 <w:rFonts w:cs="Arial"/>
@@ -1379,18 +2077,7 @@
                 <w:sz w:val="28"/>
                 <w:szCs w:val="32"/>
               </w:rPr>
-              <w:t>Panchaati</w:t>
-            </w:r>
-            <w:proofErr w:type="spellEnd"/>
-            <w:r>
-              <w:rPr>
-                <w:rFonts w:cs="Arial"/>
-                <w:b/>
-                <w:color w:val="000000"/>
-                <w:sz w:val="28"/>
-                <w:szCs w:val="32"/>
-              </w:rPr>
-              <w:t xml:space="preserve"> No</w:t>
+              <w:t>Panchaati No</w:t>
             </w:r>
             <w:r>
               <w:rPr>
@@ -1666,7 +2353,6 @@
               </w:rPr>
               <w:t>–</w:t>
             </w:r>
-            <w:proofErr w:type="spellStart"/>
             <w:r>
               <w:rPr>
                 <w:rFonts w:ascii="BRH Devanagari Extra" w:hAnsi="BRH Devanagari Extra" w:cs="BRH Devanagari Extra"/>
@@ -1676,7 +2362,6 @@
               </w:rPr>
               <w:t>mÉ</w:t>
             </w:r>
-            <w:proofErr w:type="spellEnd"/>
             <w:r>
               <w:rPr>
                 <w:rFonts w:ascii="BRH Malayalam Extra" w:hAnsi="BRH Malayalam Extra" w:cs="BRH Devanagari Extra"/>
@@ -1938,7 +2623,6 @@
               </w:rPr>
               <w:t>–</w:t>
             </w:r>
-            <w:proofErr w:type="spellStart"/>
             <w:r>
               <w:rPr>
                 <w:rFonts w:ascii="BRH Devanagari Extra" w:hAnsi="BRH Devanagari Extra" w:cs="BRH Devanagari Extra"/>
@@ -1948,7 +2632,6 @@
               </w:rPr>
               <w:t>mÉ</w:t>
             </w:r>
-            <w:proofErr w:type="spellEnd"/>
             <w:r>
               <w:rPr>
                 <w:rFonts w:ascii="BRH Malayalam Extra" w:hAnsi="BRH Malayalam Extra" w:cs="BRH Devanagari Extra"/>
@@ -2026,20 +2709,8 @@
                 <w:sz w:val="28"/>
                 <w:szCs w:val="32"/>
               </w:rPr>
-              <w:t xml:space="preserve">– </w:t>
-            </w:r>
-            <w:proofErr w:type="spellStart"/>
-            <w:r>
-              <w:rPr>
-                <w:rFonts w:cs="Arial"/>
-                <w:b/>
-                <w:color w:val="000000"/>
-                <w:sz w:val="28"/>
-                <w:szCs w:val="32"/>
-              </w:rPr>
-              <w:t>Kramam</w:t>
-            </w:r>
-            <w:proofErr w:type="spellEnd"/>
+              <w:t>– Kramam</w:t>
+            </w:r>
           </w:p>
           <w:p>
             <w:pPr>
@@ -2060,7 +2731,6 @@
                 <w:szCs w:val="32"/>
               </w:rPr>
             </w:pPr>
-            <w:proofErr w:type="spellStart"/>
             <w:r>
               <w:rPr>
                 <w:rFonts w:cs="Arial"/>
@@ -2069,40 +2739,7 @@
                 <w:sz w:val="28"/>
                 <w:szCs w:val="32"/>
               </w:rPr>
-              <w:t>Krama</w:t>
-            </w:r>
-            <w:proofErr w:type="spellEnd"/>
-            <w:r>
-              <w:rPr>
-                <w:rFonts w:cs="Arial"/>
-                <w:b/>
-                <w:color w:val="000000"/>
-                <w:sz w:val="28"/>
-                <w:szCs w:val="32"/>
-              </w:rPr>
-              <w:t xml:space="preserve"> </w:t>
-            </w:r>
-            <w:proofErr w:type="spellStart"/>
-            <w:r>
-              <w:rPr>
-                <w:rFonts w:cs="Arial"/>
-                <w:b/>
-                <w:color w:val="000000"/>
-                <w:sz w:val="28"/>
-                <w:szCs w:val="32"/>
-              </w:rPr>
-              <w:t>Vaakyam</w:t>
-            </w:r>
-            <w:proofErr w:type="spellEnd"/>
-            <w:r>
-              <w:rPr>
-                <w:rFonts w:cs="Arial"/>
-                <w:b/>
-                <w:color w:val="000000"/>
-                <w:sz w:val="28"/>
-                <w:szCs w:val="32"/>
-              </w:rPr>
-              <w:t xml:space="preserve"> No. - </w:t>
+              <w:t xml:space="preserve">Krama Vaakyam No. - </w:t>
             </w:r>
             <w:r>
               <w:rPr>
@@ -2134,7 +2771,6 @@
                 <w:szCs w:val="32"/>
               </w:rPr>
             </w:pPr>
-            <w:proofErr w:type="spellStart"/>
             <w:r>
               <w:rPr>
                 <w:rFonts w:cs="Arial"/>
@@ -2143,18 +2779,7 @@
                 <w:sz w:val="28"/>
                 <w:szCs w:val="32"/>
               </w:rPr>
-              <w:t>Panchaati</w:t>
-            </w:r>
-            <w:proofErr w:type="spellEnd"/>
-            <w:r>
-              <w:rPr>
-                <w:rFonts w:cs="Arial"/>
-                <w:b/>
-                <w:color w:val="000000"/>
-                <w:sz w:val="28"/>
-                <w:szCs w:val="32"/>
-              </w:rPr>
-              <w:t xml:space="preserve"> No</w:t>
+              <w:t>Panchaati No</w:t>
             </w:r>
             <w:r>
               <w:rPr>
@@ -2673,8 +3298,6 @@
           <w:bCs/>
         </w:rPr>
       </w:pPr>
-      <w:bookmarkStart w:id="0" w:name="_GoBack"/>
-      <w:bookmarkEnd w:id="0"/>
       <w:r>
         <w:rPr>
           <w:b/>
@@ -2683,52 +3306,7 @@
           <w:szCs w:val="32"/>
           <w:u w:val="single"/>
         </w:rPr>
-        <w:lastRenderedPageBreak/>
-        <w:t xml:space="preserve">TS </w:t>
-      </w:r>
-      <w:proofErr w:type="spellStart"/>
-      <w:r>
-        <w:rPr>
-          <w:b/>
-          <w:bCs/>
-          <w:sz w:val="28"/>
-          <w:szCs w:val="32"/>
-          <w:u w:val="single"/>
-        </w:rPr>
-        <w:t>Krama</w:t>
-      </w:r>
-      <w:proofErr w:type="spellEnd"/>
-      <w:r>
-        <w:rPr>
-          <w:b/>
-          <w:bCs/>
-          <w:sz w:val="28"/>
-          <w:szCs w:val="32"/>
-          <w:u w:val="single"/>
-        </w:rPr>
-        <w:t xml:space="preserve"> </w:t>
-      </w:r>
-      <w:proofErr w:type="spellStart"/>
-      <w:r>
-        <w:rPr>
-          <w:b/>
-          <w:bCs/>
-          <w:sz w:val="28"/>
-          <w:szCs w:val="32"/>
-          <w:u w:val="single"/>
-        </w:rPr>
-        <w:t>Paatam</w:t>
-      </w:r>
-      <w:proofErr w:type="spellEnd"/>
-      <w:r>
-        <w:rPr>
-          <w:b/>
-          <w:bCs/>
-          <w:sz w:val="28"/>
-          <w:szCs w:val="32"/>
-          <w:u w:val="single"/>
-        </w:rPr>
-        <w:t xml:space="preserve"> – TS </w:t>
+        <w:t xml:space="preserve">TS Krama Paatam – TS </w:t>
       </w:r>
       <w:r>
         <w:rPr>
@@ -3023,13 +3601,6 @@
       <w:pPr>
         <w:ind w:left="-709" w:firstLine="709"/>
         <w:jc w:val="center"/>
-        <w:rPr>
-          <w:b/>
-          <w:bCs/>
-          <w:sz w:val="32"/>
-          <w:szCs w:val="32"/>
-          <w:u w:val="single"/>
-        </w:rPr>
       </w:pPr>
       <w:r>
         <w:rPr>
@@ -3042,7 +3613,6 @@
         <w:t>=========================</w:t>
       </w:r>
     </w:p>
-    <w:p/>
     <w:sectPr>
       <w:headerReference w:type="even" r:id="rId7"/>
       <w:headerReference w:type="default" r:id="rId8"/>
@@ -3058,7 +3628,7 @@
 </file>
 
 <file path=word/endnotes.xml><?xml version="1.0" encoding="utf-8"?>
-<w:endnotes xmlns:wpc="http://schemas.microsoft.com/office/word/2010/wordprocessingCanvas" xmlns:cx="http://schemas.microsoft.com/office/drawing/2014/chartex" xmlns:cx1="http://schemas.microsoft.com/office/drawing/2015/9/8/chartex" xmlns:mc="http://schemas.openxmlformats.org/markup-compatibility/2006" xmlns:o="urn:schemas-microsoft-com:office:office" xmlns:r="http://schemas.openxmlformats.org/officeDocument/2006/relationships" xmlns:m="http://schemas.openxmlformats.org/officeDocument/2006/math" xmlns:v="urn:schemas-microsoft-com:vml" xmlns:wp14="http://schemas.microsoft.com/office/word/2010/wordprocessingDrawing" xmlns:wp="http://schemas.openxmlformats.org/drawingml/2006/wordprocessingDrawing" xmlns:w10="urn:schemas-microsoft-com:office:word" xmlns:w="http://schemas.openxmlformats.org/wordprocessingml/2006/main" xmlns:w14="http://schemas.microsoft.com/office/word/2010/wordml" xmlns:w15="http://schemas.microsoft.com/office/word/2012/wordml" xmlns:w16se="http://schemas.microsoft.com/office/word/2015/wordml/symex" xmlns:wpg="http://schemas.microsoft.com/office/word/2010/wordprocessingGroup" xmlns:wpi="http://schemas.microsoft.com/office/word/2010/wordprocessingInk" xmlns:wne="http://schemas.microsoft.com/office/word/2006/wordml" xmlns:wps="http://schemas.microsoft.com/office/word/2010/wordprocessingShape" mc:Ignorable="w14 w15 w16se wp14">
+<w:endnotes xmlns:wpc="http://schemas.microsoft.com/office/word/2010/wordprocessingCanvas" xmlns:cx="http://schemas.microsoft.com/office/drawing/2014/chartex" xmlns:cx1="http://schemas.microsoft.com/office/drawing/2015/9/8/chartex" xmlns:cx2="http://schemas.microsoft.com/office/drawing/2015/10/21/chartex" xmlns:cx3="http://schemas.microsoft.com/office/drawing/2016/5/9/chartex" xmlns:cx4="http://schemas.microsoft.com/office/drawing/2016/5/10/chartex" xmlns:cx5="http://schemas.microsoft.com/office/drawing/2016/5/11/chartex" xmlns:cx6="http://schemas.microsoft.com/office/drawing/2016/5/12/chartex" xmlns:cx7="http://schemas.microsoft.com/office/drawing/2016/5/13/chartex" xmlns:cx8="http://schemas.microsoft.com/office/drawing/2016/5/14/chartex" xmlns:mc="http://schemas.openxmlformats.org/markup-compatibility/2006" xmlns:aink="http://schemas.microsoft.com/office/drawing/2016/ink" xmlns:am3d="http://schemas.microsoft.com/office/drawing/2017/model3d" xmlns:o="urn:schemas-microsoft-com:office:office" xmlns:oel="http://schemas.microsoft.com/office/2019/extlst" xmlns:r="http://schemas.openxmlformats.org/officeDocument/2006/relationships" xmlns:m="http://schemas.openxmlformats.org/officeDocument/2006/math" xmlns:v="urn:schemas-microsoft-com:vml" xmlns:wp14="http://schemas.microsoft.com/office/word/2010/wordprocessingDrawing" xmlns:wp="http://schemas.openxmlformats.org/drawingml/2006/wordprocessingDrawing" xmlns:w10="urn:schemas-microsoft-com:office:word" xmlns:w="http://schemas.openxmlformats.org/wordprocessingml/2006/main" xmlns:w14="http://schemas.microsoft.com/office/word/2010/wordml" xmlns:w15="http://schemas.microsoft.com/office/word/2012/wordml" xmlns:w16cex="http://schemas.microsoft.com/office/word/2018/wordml/cex" xmlns:w16cid="http://schemas.microsoft.com/office/word/2016/wordml/cid" xmlns:w16="http://schemas.microsoft.com/office/word/2018/wordml" xmlns:w16du="http://schemas.microsoft.com/office/word/2023/wordml/word16du" xmlns:w16sdtdh="http://schemas.microsoft.com/office/word/2020/wordml/sdtdatahash" xmlns:w16sdtfl="http://schemas.microsoft.com/office/word/2024/wordml/sdtformatlock" xmlns:w16se="http://schemas.microsoft.com/office/word/2015/wordml/symex" xmlns:wpg="http://schemas.microsoft.com/office/word/2010/wordprocessingGroup" xmlns:wpi="http://schemas.microsoft.com/office/word/2010/wordprocessingInk" xmlns:wne="http://schemas.microsoft.com/office/word/2006/wordml" xmlns:wps="http://schemas.microsoft.com/office/word/2010/wordprocessingShape" mc:Ignorable="w14 w15 w16se w16cid w16 w16cex w16sdtdh w16sdtfl w16du wp14">
   <w:endnote w:type="separator" w:id="-1">
     <w:p>
       <w:pPr>
@@ -3083,7 +3653,7 @@
 </file>
 
 <file path=word/footer1.xml><?xml version="1.0" encoding="utf-8"?>
-<w:ftr xmlns:wpc="http://schemas.microsoft.com/office/word/2010/wordprocessingCanvas" xmlns:cx="http://schemas.microsoft.com/office/drawing/2014/chartex" xmlns:cx1="http://schemas.microsoft.com/office/drawing/2015/9/8/chartex" xmlns:mc="http://schemas.openxmlformats.org/markup-compatibility/2006" xmlns:o="urn:schemas-microsoft-com:office:office" xmlns:r="http://schemas.openxmlformats.org/officeDocument/2006/relationships" xmlns:m="http://schemas.openxmlformats.org/officeDocument/2006/math" xmlns:v="urn:schemas-microsoft-com:vml" xmlns:wp14="http://schemas.microsoft.com/office/word/2010/wordprocessingDrawing" xmlns:wp="http://schemas.openxmlformats.org/drawingml/2006/wordprocessingDrawing" xmlns:w10="urn:schemas-microsoft-com:office:word" xmlns:w="http://schemas.openxmlformats.org/wordprocessingml/2006/main" xmlns:w14="http://schemas.microsoft.com/office/word/2010/wordml" xmlns:w15="http://schemas.microsoft.com/office/word/2012/wordml" xmlns:w16se="http://schemas.microsoft.com/office/word/2015/wordml/symex" xmlns:wpg="http://schemas.microsoft.com/office/word/2010/wordprocessingGroup" xmlns:wpi="http://schemas.microsoft.com/office/word/2010/wordprocessingInk" xmlns:wne="http://schemas.microsoft.com/office/word/2006/wordml" xmlns:wps="http://schemas.microsoft.com/office/word/2010/wordprocessingShape" mc:Ignorable="w14 w15 w16se wp14">
+<w:ftr xmlns:wpc="http://schemas.microsoft.com/office/word/2010/wordprocessingCanvas" xmlns:cx="http://schemas.microsoft.com/office/drawing/2014/chartex" xmlns:cx1="http://schemas.microsoft.com/office/drawing/2015/9/8/chartex" xmlns:cx2="http://schemas.microsoft.com/office/drawing/2015/10/21/chartex" xmlns:cx3="http://schemas.microsoft.com/office/drawing/2016/5/9/chartex" xmlns:cx4="http://schemas.microsoft.com/office/drawing/2016/5/10/chartex" xmlns:cx5="http://schemas.microsoft.com/office/drawing/2016/5/11/chartex" xmlns:cx6="http://schemas.microsoft.com/office/drawing/2016/5/12/chartex" xmlns:cx7="http://schemas.microsoft.com/office/drawing/2016/5/13/chartex" xmlns:cx8="http://schemas.microsoft.com/office/drawing/2016/5/14/chartex" xmlns:mc="http://schemas.openxmlformats.org/markup-compatibility/2006" xmlns:aink="http://schemas.microsoft.com/office/drawing/2016/ink" xmlns:am3d="http://schemas.microsoft.com/office/drawing/2017/model3d" xmlns:o="urn:schemas-microsoft-com:office:office" xmlns:oel="http://schemas.microsoft.com/office/2019/extlst" xmlns:r="http://schemas.openxmlformats.org/officeDocument/2006/relationships" xmlns:m="http://schemas.openxmlformats.org/officeDocument/2006/math" xmlns:v="urn:schemas-microsoft-com:vml" xmlns:wp14="http://schemas.microsoft.com/office/word/2010/wordprocessingDrawing" xmlns:wp="http://schemas.openxmlformats.org/drawingml/2006/wordprocessingDrawing" xmlns:w10="urn:schemas-microsoft-com:office:word" xmlns:w="http://schemas.openxmlformats.org/wordprocessingml/2006/main" xmlns:w14="http://schemas.microsoft.com/office/word/2010/wordml" xmlns:w15="http://schemas.microsoft.com/office/word/2012/wordml" xmlns:w16cex="http://schemas.microsoft.com/office/word/2018/wordml/cex" xmlns:w16cid="http://schemas.microsoft.com/office/word/2016/wordml/cid" xmlns:w16="http://schemas.microsoft.com/office/word/2018/wordml" xmlns:w16du="http://schemas.microsoft.com/office/word/2023/wordml/word16du" xmlns:w16sdtdh="http://schemas.microsoft.com/office/word/2020/wordml/sdtdatahash" xmlns:w16sdtfl="http://schemas.microsoft.com/office/word/2024/wordml/sdtformatlock" xmlns:w16se="http://schemas.microsoft.com/office/word/2015/wordml/symex" xmlns:wpg="http://schemas.microsoft.com/office/word/2010/wordprocessingGroup" xmlns:wpi="http://schemas.microsoft.com/office/word/2010/wordprocessingInk" xmlns:wne="http://schemas.microsoft.com/office/word/2006/wordml" xmlns:wps="http://schemas.microsoft.com/office/word/2010/wordprocessingShape" mc:Ignorable="w14 w15 w16se w16cid w16 w16cex w16sdtdh w16sdtfl w16du wp14">
   <w:p>
     <w:pPr>
       <w:pBdr>
@@ -3136,14 +3706,35 @@
         <w:bCs/>
       </w:rPr>
       <w:tab/>
-      <w:t xml:space="preserve">              v</w:t>
-    </w:r>
-    <w:r>
-      <w:rPr>
-        <w:b/>
-        <w:bCs/>
-      </w:rPr>
-      <w:t>edavms@gmail.com</w:t>
+      <w:t xml:space="preserve">           </w:t>
+    </w:r>
+    <w:r>
+      <w:rPr>
+        <w:b/>
+        <w:bCs/>
+      </w:rPr>
+      <w:t>www.</w:t>
+    </w:r>
+    <w:r>
+      <w:rPr>
+        <w:b/>
+        <w:bCs/>
+      </w:rPr>
+      <w:t>v</w:t>
+    </w:r>
+    <w:r>
+      <w:rPr>
+        <w:b/>
+        <w:bCs/>
+      </w:rPr>
+      <w:t>edavms</w:t>
+    </w:r>
+    <w:r>
+      <w:rPr>
+        <w:b/>
+        <w:bCs/>
+      </w:rPr>
+      <w:t>.in</w:t>
     </w:r>
     <w:r>
       <w:rPr>
@@ -3162,6 +3753,9 @@
     </w:r>
     <w:r>
       <w:tab/>
+    </w:r>
+    <w:r>
+      <w:t xml:space="preserve">                       </w:t>
     </w:r>
     <w:r>
       <w:tab/>
@@ -3265,7 +3859,7 @@
 </file>
 
 <file path=word/footer2.xml><?xml version="1.0" encoding="utf-8"?>
-<w:ftr xmlns:wpc="http://schemas.microsoft.com/office/word/2010/wordprocessingCanvas" xmlns:cx="http://schemas.microsoft.com/office/drawing/2014/chartex" xmlns:cx1="http://schemas.microsoft.com/office/drawing/2015/9/8/chartex" xmlns:mc="http://schemas.openxmlformats.org/markup-compatibility/2006" xmlns:o="urn:schemas-microsoft-com:office:office" xmlns:r="http://schemas.openxmlformats.org/officeDocument/2006/relationships" xmlns:m="http://schemas.openxmlformats.org/officeDocument/2006/math" xmlns:v="urn:schemas-microsoft-com:vml" xmlns:wp14="http://schemas.microsoft.com/office/word/2010/wordprocessingDrawing" xmlns:wp="http://schemas.openxmlformats.org/drawingml/2006/wordprocessingDrawing" xmlns:w10="urn:schemas-microsoft-com:office:word" xmlns:w="http://schemas.openxmlformats.org/wordprocessingml/2006/main" xmlns:w14="http://schemas.microsoft.com/office/word/2010/wordml" xmlns:w15="http://schemas.microsoft.com/office/word/2012/wordml" xmlns:w16se="http://schemas.microsoft.com/office/word/2015/wordml/symex" xmlns:wpg="http://schemas.microsoft.com/office/word/2010/wordprocessingGroup" xmlns:wpi="http://schemas.microsoft.com/office/word/2010/wordprocessingInk" xmlns:wne="http://schemas.microsoft.com/office/word/2006/wordml" xmlns:wps="http://schemas.microsoft.com/office/word/2010/wordprocessingShape" mc:Ignorable="w14 w15 w16se wp14">
+<w:ftr xmlns:wpc="http://schemas.microsoft.com/office/word/2010/wordprocessingCanvas" xmlns:cx="http://schemas.microsoft.com/office/drawing/2014/chartex" xmlns:cx1="http://schemas.microsoft.com/office/drawing/2015/9/8/chartex" xmlns:cx2="http://schemas.microsoft.com/office/drawing/2015/10/21/chartex" xmlns:cx3="http://schemas.microsoft.com/office/drawing/2016/5/9/chartex" xmlns:cx4="http://schemas.microsoft.com/office/drawing/2016/5/10/chartex" xmlns:cx5="http://schemas.microsoft.com/office/drawing/2016/5/11/chartex" xmlns:cx6="http://schemas.microsoft.com/office/drawing/2016/5/12/chartex" xmlns:cx7="http://schemas.microsoft.com/office/drawing/2016/5/13/chartex" xmlns:cx8="http://schemas.microsoft.com/office/drawing/2016/5/14/chartex" xmlns:mc="http://schemas.openxmlformats.org/markup-compatibility/2006" xmlns:aink="http://schemas.microsoft.com/office/drawing/2016/ink" xmlns:am3d="http://schemas.microsoft.com/office/drawing/2017/model3d" xmlns:o="urn:schemas-microsoft-com:office:office" xmlns:oel="http://schemas.microsoft.com/office/2019/extlst" xmlns:r="http://schemas.openxmlformats.org/officeDocument/2006/relationships" xmlns:m="http://schemas.openxmlformats.org/officeDocument/2006/math" xmlns:v="urn:schemas-microsoft-com:vml" xmlns:wp14="http://schemas.microsoft.com/office/word/2010/wordprocessingDrawing" xmlns:wp="http://schemas.openxmlformats.org/drawingml/2006/wordprocessingDrawing" xmlns:w10="urn:schemas-microsoft-com:office:word" xmlns:w="http://schemas.openxmlformats.org/wordprocessingml/2006/main" xmlns:w14="http://schemas.microsoft.com/office/word/2010/wordml" xmlns:w15="http://schemas.microsoft.com/office/word/2012/wordml" xmlns:w16cex="http://schemas.microsoft.com/office/word/2018/wordml/cex" xmlns:w16cid="http://schemas.microsoft.com/office/word/2016/wordml/cid" xmlns:w16="http://schemas.microsoft.com/office/word/2018/wordml" xmlns:w16du="http://schemas.microsoft.com/office/word/2023/wordml/word16du" xmlns:w16sdtdh="http://schemas.microsoft.com/office/word/2020/wordml/sdtdatahash" xmlns:w16sdtfl="http://schemas.microsoft.com/office/word/2024/wordml/sdtformatlock" xmlns:w16se="http://schemas.microsoft.com/office/word/2015/wordml/symex" xmlns:wpg="http://schemas.microsoft.com/office/word/2010/wordprocessingGroup" xmlns:wpi="http://schemas.microsoft.com/office/word/2010/wordprocessingInk" xmlns:wne="http://schemas.microsoft.com/office/word/2006/wordml" xmlns:wps="http://schemas.microsoft.com/office/word/2010/wordprocessingShape" mc:Ignorable="w14 w15 w16se w16cid w16 w16cex w16sdtdh w16sdtfl w16du wp14">
   <w:p>
     <w:pPr>
       <w:pBdr>
@@ -3353,6 +3947,19 @@
         <w:bCs/>
       </w:rPr>
       <w:tab/>
+    </w:r>
+    <w:r>
+      <w:rPr>
+        <w:b/>
+        <w:bCs/>
+      </w:rPr>
+      <w:t xml:space="preserve">           </w:t>
+    </w:r>
+    <w:r>
+      <w:rPr>
+        <w:b/>
+        <w:bCs/>
+      </w:rPr>
       <w:t xml:space="preserve"> </w:t>
     </w:r>
     <w:r>
@@ -3468,7 +4075,7 @@
 </file>
 
 <file path=word/footnotes.xml><?xml version="1.0" encoding="utf-8"?>
-<w:footnotes xmlns:wpc="http://schemas.microsoft.com/office/word/2010/wordprocessingCanvas" xmlns:cx="http://schemas.microsoft.com/office/drawing/2014/chartex" xmlns:cx1="http://schemas.microsoft.com/office/drawing/2015/9/8/chartex" xmlns:mc="http://schemas.openxmlformats.org/markup-compatibility/2006" xmlns:o="urn:schemas-microsoft-com:office:office" xmlns:r="http://schemas.openxmlformats.org/officeDocument/2006/relationships" xmlns:m="http://schemas.openxmlformats.org/officeDocument/2006/math" xmlns:v="urn:schemas-microsoft-com:vml" xmlns:wp14="http://schemas.microsoft.com/office/word/2010/wordprocessingDrawing" xmlns:wp="http://schemas.openxmlformats.org/drawingml/2006/wordprocessingDrawing" xmlns:w10="urn:schemas-microsoft-com:office:word" xmlns:w="http://schemas.openxmlformats.org/wordprocessingml/2006/main" xmlns:w14="http://schemas.microsoft.com/office/word/2010/wordml" xmlns:w15="http://schemas.microsoft.com/office/word/2012/wordml" xmlns:w16se="http://schemas.microsoft.com/office/word/2015/wordml/symex" xmlns:wpg="http://schemas.microsoft.com/office/word/2010/wordprocessingGroup" xmlns:wpi="http://schemas.microsoft.com/office/word/2010/wordprocessingInk" xmlns:wne="http://schemas.microsoft.com/office/word/2006/wordml" xmlns:wps="http://schemas.microsoft.com/office/word/2010/wordprocessingShape" mc:Ignorable="w14 w15 w16se wp14">
+<w:footnotes xmlns:wpc="http://schemas.microsoft.com/office/word/2010/wordprocessingCanvas" xmlns:cx="http://schemas.microsoft.com/office/drawing/2014/chartex" xmlns:cx1="http://schemas.microsoft.com/office/drawing/2015/9/8/chartex" xmlns:cx2="http://schemas.microsoft.com/office/drawing/2015/10/21/chartex" xmlns:cx3="http://schemas.microsoft.com/office/drawing/2016/5/9/chartex" xmlns:cx4="http://schemas.microsoft.com/office/drawing/2016/5/10/chartex" xmlns:cx5="http://schemas.microsoft.com/office/drawing/2016/5/11/chartex" xmlns:cx6="http://schemas.microsoft.com/office/drawing/2016/5/12/chartex" xmlns:cx7="http://schemas.microsoft.com/office/drawing/2016/5/13/chartex" xmlns:cx8="http://schemas.microsoft.com/office/drawing/2016/5/14/chartex" xmlns:mc="http://schemas.openxmlformats.org/markup-compatibility/2006" xmlns:aink="http://schemas.microsoft.com/office/drawing/2016/ink" xmlns:am3d="http://schemas.microsoft.com/office/drawing/2017/model3d" xmlns:o="urn:schemas-microsoft-com:office:office" xmlns:oel="http://schemas.microsoft.com/office/2019/extlst" xmlns:r="http://schemas.openxmlformats.org/officeDocument/2006/relationships" xmlns:m="http://schemas.openxmlformats.org/officeDocument/2006/math" xmlns:v="urn:schemas-microsoft-com:vml" xmlns:wp14="http://schemas.microsoft.com/office/word/2010/wordprocessingDrawing" xmlns:wp="http://schemas.openxmlformats.org/drawingml/2006/wordprocessingDrawing" xmlns:w10="urn:schemas-microsoft-com:office:word" xmlns:w="http://schemas.openxmlformats.org/wordprocessingml/2006/main" xmlns:w14="http://schemas.microsoft.com/office/word/2010/wordml" xmlns:w15="http://schemas.microsoft.com/office/word/2012/wordml" xmlns:w16cex="http://schemas.microsoft.com/office/word/2018/wordml/cex" xmlns:w16cid="http://schemas.microsoft.com/office/word/2016/wordml/cid" xmlns:w16="http://schemas.microsoft.com/office/word/2018/wordml" xmlns:w16du="http://schemas.microsoft.com/office/word/2023/wordml/word16du" xmlns:w16sdtdh="http://schemas.microsoft.com/office/word/2020/wordml/sdtdatahash" xmlns:w16sdtfl="http://schemas.microsoft.com/office/word/2024/wordml/sdtformatlock" xmlns:w16se="http://schemas.microsoft.com/office/word/2015/wordml/symex" xmlns:wpg="http://schemas.microsoft.com/office/word/2010/wordprocessingGroup" xmlns:wpi="http://schemas.microsoft.com/office/word/2010/wordprocessingInk" xmlns:wne="http://schemas.microsoft.com/office/word/2006/wordml" xmlns:wps="http://schemas.microsoft.com/office/word/2010/wordprocessingShape" mc:Ignorable="w14 w15 w16se w16cid w16 w16cex w16sdtdh w16sdtfl w16du wp14">
   <w:footnote w:type="separator" w:id="-1">
     <w:p>
       <w:pPr>
@@ -3493,7 +4100,7 @@
 </file>
 
 <file path=word/header1.xml><?xml version="1.0" encoding="utf-8"?>
-<w:hdr xmlns:wpc="http://schemas.microsoft.com/office/word/2010/wordprocessingCanvas" xmlns:cx="http://schemas.microsoft.com/office/drawing/2014/chartex" xmlns:cx1="http://schemas.microsoft.com/office/drawing/2015/9/8/chartex" xmlns:mc="http://schemas.openxmlformats.org/markup-compatibility/2006" xmlns:o="urn:schemas-microsoft-com:office:office" xmlns:r="http://schemas.openxmlformats.org/officeDocument/2006/relationships" xmlns:m="http://schemas.openxmlformats.org/officeDocument/2006/math" xmlns:v="urn:schemas-microsoft-com:vml" xmlns:wp14="http://schemas.microsoft.com/office/word/2010/wordprocessingDrawing" xmlns:wp="http://schemas.openxmlformats.org/drawingml/2006/wordprocessingDrawing" xmlns:w10="urn:schemas-microsoft-com:office:word" xmlns:w="http://schemas.openxmlformats.org/wordprocessingml/2006/main" xmlns:w14="http://schemas.microsoft.com/office/word/2010/wordml" xmlns:w15="http://schemas.microsoft.com/office/word/2012/wordml" xmlns:w16se="http://schemas.microsoft.com/office/word/2015/wordml/symex" xmlns:wpg="http://schemas.microsoft.com/office/word/2010/wordprocessingGroup" xmlns:wpi="http://schemas.microsoft.com/office/word/2010/wordprocessingInk" xmlns:wne="http://schemas.microsoft.com/office/word/2006/wordml" xmlns:wps="http://schemas.microsoft.com/office/word/2010/wordprocessingShape" mc:Ignorable="w14 w15 w16se wp14">
+<w:hdr xmlns:wpc="http://schemas.microsoft.com/office/word/2010/wordprocessingCanvas" xmlns:cx="http://schemas.microsoft.com/office/drawing/2014/chartex" xmlns:cx1="http://schemas.microsoft.com/office/drawing/2015/9/8/chartex" xmlns:cx2="http://schemas.microsoft.com/office/drawing/2015/10/21/chartex" xmlns:cx3="http://schemas.microsoft.com/office/drawing/2016/5/9/chartex" xmlns:cx4="http://schemas.microsoft.com/office/drawing/2016/5/10/chartex" xmlns:cx5="http://schemas.microsoft.com/office/drawing/2016/5/11/chartex" xmlns:cx6="http://schemas.microsoft.com/office/drawing/2016/5/12/chartex" xmlns:cx7="http://schemas.microsoft.com/office/drawing/2016/5/13/chartex" xmlns:cx8="http://schemas.microsoft.com/office/drawing/2016/5/14/chartex" xmlns:mc="http://schemas.openxmlformats.org/markup-compatibility/2006" xmlns:aink="http://schemas.microsoft.com/office/drawing/2016/ink" xmlns:am3d="http://schemas.microsoft.com/office/drawing/2017/model3d" xmlns:o="urn:schemas-microsoft-com:office:office" xmlns:oel="http://schemas.microsoft.com/office/2019/extlst" xmlns:r="http://schemas.openxmlformats.org/officeDocument/2006/relationships" xmlns:m="http://schemas.openxmlformats.org/officeDocument/2006/math" xmlns:v="urn:schemas-microsoft-com:vml" xmlns:wp14="http://schemas.microsoft.com/office/word/2010/wordprocessingDrawing" xmlns:wp="http://schemas.openxmlformats.org/drawingml/2006/wordprocessingDrawing" xmlns:w10="urn:schemas-microsoft-com:office:word" xmlns:w="http://schemas.openxmlformats.org/wordprocessingml/2006/main" xmlns:w14="http://schemas.microsoft.com/office/word/2010/wordml" xmlns:w15="http://schemas.microsoft.com/office/word/2012/wordml" xmlns:w16cex="http://schemas.microsoft.com/office/word/2018/wordml/cex" xmlns:w16cid="http://schemas.microsoft.com/office/word/2016/wordml/cid" xmlns:w16="http://schemas.microsoft.com/office/word/2018/wordml" xmlns:w16du="http://schemas.microsoft.com/office/word/2023/wordml/word16du" xmlns:w16sdtdh="http://schemas.microsoft.com/office/word/2020/wordml/sdtdatahash" xmlns:w16sdtfl="http://schemas.microsoft.com/office/word/2024/wordml/sdtformatlock" xmlns:w16se="http://schemas.microsoft.com/office/word/2015/wordml/symex" xmlns:wpg="http://schemas.microsoft.com/office/word/2010/wordprocessingGroup" xmlns:wpi="http://schemas.microsoft.com/office/word/2010/wordprocessingInk" xmlns:wne="http://schemas.microsoft.com/office/word/2006/wordml" xmlns:wps="http://schemas.microsoft.com/office/word/2010/wordprocessingShape" mc:Ignorable="w14 w15 w16se w16cid w16 w16cex w16sdtdh w16sdtfl w16du wp14">
   <w:p>
     <w:pPr>
       <w:pStyle w:val="Header"/>
@@ -3506,7 +4113,7 @@
 </file>
 
 <file path=word/header2.xml><?xml version="1.0" encoding="utf-8"?>
-<w:hdr xmlns:wpc="http://schemas.microsoft.com/office/word/2010/wordprocessingCanvas" xmlns:cx="http://schemas.microsoft.com/office/drawing/2014/chartex" xmlns:cx1="http://schemas.microsoft.com/office/drawing/2015/9/8/chartex" xmlns:mc="http://schemas.openxmlformats.org/markup-compatibility/2006" xmlns:o="urn:schemas-microsoft-com:office:office" xmlns:r="http://schemas.openxmlformats.org/officeDocument/2006/relationships" xmlns:m="http://schemas.openxmlformats.org/officeDocument/2006/math" xmlns:v="urn:schemas-microsoft-com:vml" xmlns:wp14="http://schemas.microsoft.com/office/word/2010/wordprocessingDrawing" xmlns:wp="http://schemas.openxmlformats.org/drawingml/2006/wordprocessingDrawing" xmlns:w10="urn:schemas-microsoft-com:office:word" xmlns:w="http://schemas.openxmlformats.org/wordprocessingml/2006/main" xmlns:w14="http://schemas.microsoft.com/office/word/2010/wordml" xmlns:w15="http://schemas.microsoft.com/office/word/2012/wordml" xmlns:w16se="http://schemas.microsoft.com/office/word/2015/wordml/symex" xmlns:wpg="http://schemas.microsoft.com/office/word/2010/wordprocessingGroup" xmlns:wpi="http://schemas.microsoft.com/office/word/2010/wordprocessingInk" xmlns:wne="http://schemas.microsoft.com/office/word/2006/wordml" xmlns:wps="http://schemas.microsoft.com/office/word/2010/wordprocessingShape" mc:Ignorable="w14 w15 w16se wp14">
+<w:hdr xmlns:wpc="http://schemas.microsoft.com/office/word/2010/wordprocessingCanvas" xmlns:cx="http://schemas.microsoft.com/office/drawing/2014/chartex" xmlns:cx1="http://schemas.microsoft.com/office/drawing/2015/9/8/chartex" xmlns:cx2="http://schemas.microsoft.com/office/drawing/2015/10/21/chartex" xmlns:cx3="http://schemas.microsoft.com/office/drawing/2016/5/9/chartex" xmlns:cx4="http://schemas.microsoft.com/office/drawing/2016/5/10/chartex" xmlns:cx5="http://schemas.microsoft.com/office/drawing/2016/5/11/chartex" xmlns:cx6="http://schemas.microsoft.com/office/drawing/2016/5/12/chartex" xmlns:cx7="http://schemas.microsoft.com/office/drawing/2016/5/13/chartex" xmlns:cx8="http://schemas.microsoft.com/office/drawing/2016/5/14/chartex" xmlns:mc="http://schemas.openxmlformats.org/markup-compatibility/2006" xmlns:aink="http://schemas.microsoft.com/office/drawing/2016/ink" xmlns:am3d="http://schemas.microsoft.com/office/drawing/2017/model3d" xmlns:o="urn:schemas-microsoft-com:office:office" xmlns:oel="http://schemas.microsoft.com/office/2019/extlst" xmlns:r="http://schemas.openxmlformats.org/officeDocument/2006/relationships" xmlns:m="http://schemas.openxmlformats.org/officeDocument/2006/math" xmlns:v="urn:schemas-microsoft-com:vml" xmlns:wp14="http://schemas.microsoft.com/office/word/2010/wordprocessingDrawing" xmlns:wp="http://schemas.openxmlformats.org/drawingml/2006/wordprocessingDrawing" xmlns:w10="urn:schemas-microsoft-com:office:word" xmlns:w="http://schemas.openxmlformats.org/wordprocessingml/2006/main" xmlns:w14="http://schemas.microsoft.com/office/word/2010/wordml" xmlns:w15="http://schemas.microsoft.com/office/word/2012/wordml" xmlns:w16cex="http://schemas.microsoft.com/office/word/2018/wordml/cex" xmlns:w16cid="http://schemas.microsoft.com/office/word/2016/wordml/cid" xmlns:w16="http://schemas.microsoft.com/office/word/2018/wordml" xmlns:w16du="http://schemas.microsoft.com/office/word/2023/wordml/word16du" xmlns:w16sdtdh="http://schemas.microsoft.com/office/word/2020/wordml/sdtdatahash" xmlns:w16sdtfl="http://schemas.microsoft.com/office/word/2024/wordml/sdtformatlock" xmlns:w16se="http://schemas.microsoft.com/office/word/2015/wordml/symex" xmlns:wpg="http://schemas.microsoft.com/office/word/2010/wordprocessingGroup" xmlns:wpi="http://schemas.microsoft.com/office/word/2010/wordprocessingInk" xmlns:wne="http://schemas.microsoft.com/office/word/2006/wordml" xmlns:wps="http://schemas.microsoft.com/office/word/2010/wordprocessingShape" mc:Ignorable="w14 w15 w16se w16cid w16 w16cex w16sdtdh w16sdtfl w16du wp14">
   <w:p>
     <w:pPr>
       <w:pStyle w:val="Header"/>
@@ -3519,7 +4126,7 @@
 </file>
 
 <file path=word/styles.xml><?xml version="1.0" encoding="utf-8"?>
-<w:styles xmlns:mc="http://schemas.openxmlformats.org/markup-compatibility/2006" xmlns:r="http://schemas.openxmlformats.org/officeDocument/2006/relationships" xmlns:w="http://schemas.openxmlformats.org/wordprocessingml/2006/main" xmlns:w14="http://schemas.microsoft.com/office/word/2010/wordml" xmlns:w15="http://schemas.microsoft.com/office/word/2012/wordml" xmlns:w16se="http://schemas.microsoft.com/office/word/2015/wordml/symex" mc:Ignorable="w14 w15 w16se">
+<w:styles xmlns:mc="http://schemas.openxmlformats.org/markup-compatibility/2006" xmlns:r="http://schemas.openxmlformats.org/officeDocument/2006/relationships" xmlns:w="http://schemas.openxmlformats.org/wordprocessingml/2006/main" xmlns:w14="http://schemas.microsoft.com/office/word/2010/wordml" xmlns:w15="http://schemas.microsoft.com/office/word/2012/wordml" xmlns:w16cex="http://schemas.microsoft.com/office/word/2018/wordml/cex" xmlns:w16cid="http://schemas.microsoft.com/office/word/2016/wordml/cid" xmlns:w16="http://schemas.microsoft.com/office/word/2018/wordml" xmlns:w16du="http://schemas.microsoft.com/office/word/2023/wordml/word16du" xmlns:w16sdtdh="http://schemas.microsoft.com/office/word/2020/wordml/sdtdatahash" xmlns:w16sdtfl="http://schemas.microsoft.com/office/word/2024/wordml/sdtformatlock" xmlns:w16se="http://schemas.microsoft.com/office/word/2015/wordml/symex" mc:Ignorable="w14 w15 w16se w16cid w16 w16cex w16sdtdh w16sdtfl w16du">
   <w:docDefaults>
     <w:rPrDefault>
       <w:rPr>
@@ -3529,7 +4136,7 @@
     </w:rPrDefault>
     <w:pPrDefault/>
   </w:docDefaults>
-  <w:latentStyles w:defLockedState="0" w:defUIPriority="99" w:defSemiHidden="0" w:defUnhideWhenUsed="0" w:defQFormat="0" w:count="371">
+  <w:latentStyles w:defLockedState="0" w:defUIPriority="99" w:defSemiHidden="0" w:defUnhideWhenUsed="0" w:defQFormat="0" w:count="376">
     <w:lsdException w:name="Normal" w:uiPriority="0" w:qFormat="1"/>
     <w:lsdException w:name="heading 1" w:uiPriority="9" w:qFormat="1"/>
     <w:lsdException w:name="heading 2" w:semiHidden="1" w:uiPriority="9" w:unhideWhenUsed="1" w:qFormat="1"/>
@@ -3901,11 +4508,16 @@
     <w:lsdException w:name="List Table 5 Dark Accent 6" w:uiPriority="50"/>
     <w:lsdException w:name="List Table 6 Colorful Accent 6" w:uiPriority="51"/>
     <w:lsdException w:name="List Table 7 Colorful Accent 6" w:uiPriority="52"/>
+    <w:lsdException w:name="Mention" w:semiHidden="1" w:unhideWhenUsed="1"/>
+    <w:lsdException w:name="Smart Hyperlink" w:semiHidden="1" w:unhideWhenUsed="1"/>
+    <w:lsdException w:name="Hashtag" w:semiHidden="1" w:unhideWhenUsed="1"/>
+    <w:lsdException w:name="Unresolved Mention" w:semiHidden="1" w:unhideWhenUsed="1"/>
+    <w:lsdException w:name="Smart Link" w:semiHidden="1" w:unhideWhenUsed="1"/>
   </w:latentStyles>
   <w:style w:type="paragraph" w:default="1" w:styleId="Normal">
     <w:name w:val="Normal"/>
     <w:qFormat/>
-    <w:rsid w:val="00076C05"/>
+    <w:rsid w:val="00942848"/>
     <w:pPr>
       <w:spacing w:before="120" w:line="276" w:lineRule="auto"/>
     </w:pPr>

</xml_diff>

<commit_message>
nmv 12 08 2025
</commit_message>
<xml_diff>
--- a/TS-Kramam/TS-3.3/TS 3.3 Sanskrit Krama Paatam Corrections.docx
+++ b/TS-Kramam/TS-3.3/TS 3.3 Sanskrit Krama Paatam Corrections.docx
@@ -1,6 +1,6 @@
 
 <file path=word/document.xml><?xml version="1.0" encoding="utf-8"?>
-<w:document xmlns:wpc="http://schemas.microsoft.com/office/word/2010/wordprocessingCanvas" xmlns:cx="http://schemas.microsoft.com/office/drawing/2014/chartex" xmlns:cx1="http://schemas.microsoft.com/office/drawing/2015/9/8/chartex" xmlns:cx2="http://schemas.microsoft.com/office/drawing/2015/10/21/chartex" xmlns:cx3="http://schemas.microsoft.com/office/drawing/2016/5/9/chartex" xmlns:cx4="http://schemas.microsoft.com/office/drawing/2016/5/10/chartex" xmlns:cx5="http://schemas.microsoft.com/office/drawing/2016/5/11/chartex" xmlns:cx6="http://schemas.microsoft.com/office/drawing/2016/5/12/chartex" xmlns:cx7="http://schemas.microsoft.com/office/drawing/2016/5/13/chartex" xmlns:cx8="http://schemas.microsoft.com/office/drawing/2016/5/14/chartex" xmlns:mc="http://schemas.openxmlformats.org/markup-compatibility/2006" xmlns:aink="http://schemas.microsoft.com/office/drawing/2016/ink" xmlns:am3d="http://schemas.microsoft.com/office/drawing/2017/model3d" xmlns:o="urn:schemas-microsoft-com:office:office" xmlns:oel="http://schemas.microsoft.com/office/2019/extlst" xmlns:r="http://schemas.openxmlformats.org/officeDocument/2006/relationships" xmlns:m="http://schemas.openxmlformats.org/officeDocument/2006/math" xmlns:v="urn:schemas-microsoft-com:vml" xmlns:wp14="http://schemas.microsoft.com/office/word/2010/wordprocessingDrawing" xmlns:wp="http://schemas.openxmlformats.org/drawingml/2006/wordprocessingDrawing" xmlns:w10="urn:schemas-microsoft-com:office:word" xmlns:w="http://schemas.openxmlformats.org/wordprocessingml/2006/main" xmlns:w14="http://schemas.microsoft.com/office/word/2010/wordml" xmlns:w15="http://schemas.microsoft.com/office/word/2012/wordml" xmlns:w16cex="http://schemas.microsoft.com/office/word/2018/wordml/cex" xmlns:w16cid="http://schemas.microsoft.com/office/word/2016/wordml/cid" xmlns:w16="http://schemas.microsoft.com/office/word/2018/wordml" xmlns:w16du="http://schemas.microsoft.com/office/word/2023/wordml/word16du" xmlns:w16sdtdh="http://schemas.microsoft.com/office/word/2020/wordml/sdtdatahash" xmlns:w16sdtfl="http://schemas.microsoft.com/office/word/2024/wordml/sdtformatlock" xmlns:w16se="http://schemas.microsoft.com/office/word/2015/wordml/symex" xmlns:wpg="http://schemas.microsoft.com/office/word/2010/wordprocessingGroup" xmlns:wpi="http://schemas.microsoft.com/office/word/2010/wordprocessingInk" xmlns:wne="http://schemas.microsoft.com/office/word/2006/wordml" xmlns:wps="http://schemas.microsoft.com/office/word/2010/wordprocessingShape" mc:Ignorable="w14 w15 w16se w16cid w16 w16cex w16sdtdh w16sdtfl w16du wp14">
+<w:document xmlns:wpc="http://schemas.microsoft.com/office/word/2010/wordprocessingCanvas" xmlns:cx="http://schemas.microsoft.com/office/drawing/2014/chartex" xmlns:cx1="http://schemas.microsoft.com/office/drawing/2015/9/8/chartex" xmlns:cx2="http://schemas.microsoft.com/office/drawing/2015/10/21/chartex" xmlns:cx3="http://schemas.microsoft.com/office/drawing/2016/5/9/chartex" xmlns:cx4="http://schemas.microsoft.com/office/drawing/2016/5/10/chartex" xmlns:cx5="http://schemas.microsoft.com/office/drawing/2016/5/11/chartex" xmlns:cx6="http://schemas.microsoft.com/office/drawing/2016/5/12/chartex" xmlns:cx7="http://schemas.microsoft.com/office/drawing/2016/5/13/chartex" xmlns:cx8="http://schemas.microsoft.com/office/drawing/2016/5/14/chartex" xmlns:mc="http://schemas.openxmlformats.org/markup-compatibility/2006" xmlns:aink="http://schemas.microsoft.com/office/drawing/2016/ink" xmlns:am3d="http://schemas.microsoft.com/office/drawing/2017/model3d" xmlns:o="urn:schemas-microsoft-com:office:office" xmlns:oel="http://schemas.microsoft.com/office/2019/extlst" xmlns:r="http://schemas.openxmlformats.org/officeDocument/2006/relationships" xmlns:m="http://schemas.openxmlformats.org/officeDocument/2006/math" xmlns:v="urn:schemas-microsoft-com:vml" xmlns:wp14="http://schemas.microsoft.com/office/word/2010/wordprocessingDrawing" xmlns:wp="http://schemas.openxmlformats.org/drawingml/2006/wordprocessingDrawing" xmlns:w10="urn:schemas-microsoft-com:office:word" xmlns:w="http://schemas.openxmlformats.org/wordprocessingml/2006/main" xmlns:w14="http://schemas.microsoft.com/office/word/2010/wordml" xmlns:w15="http://schemas.microsoft.com/office/word/2012/wordml" xmlns:w16cei="http://schemas.microsoft.com/office/word/2026/wordml/cei" xmlns:w16cex="http://schemas.microsoft.com/office/word/2018/wordml/cex" xmlns:w16cid="http://schemas.microsoft.com/office/word/2016/wordml/cid" xmlns:w16="http://schemas.microsoft.com/office/word/2018/wordml" xmlns:w16du="http://schemas.microsoft.com/office/word/2023/wordml/word16du" xmlns:w16sdtdh="http://schemas.microsoft.com/office/word/2020/wordml/sdtdatahash" xmlns:w16sdtfl="http://schemas.microsoft.com/office/word/2024/wordml/sdtformatlock" xmlns:w16se="http://schemas.microsoft.com/office/word/2015/wordml/symex" xmlns:wpg="http://schemas.microsoft.com/office/word/2010/wordprocessingGroup" xmlns:wpi="http://schemas.microsoft.com/office/word/2010/wordprocessingInk" xmlns:wne="http://schemas.microsoft.com/office/word/2006/wordml" xmlns:wps="http://schemas.microsoft.com/office/word/2010/wordprocessingShape" mc:Ignorable="w14 w15 w16se w16cid w16 w16cex w16sdtdh w16sdtfl w16du wp14">
   <w:body>
     <w:p>
       <w:pPr>
@@ -307,7 +307,6 @@
               <w:rPr>
                 <w:rFonts w:cs="Arial"/>
                 <w:b/>
-                <w:color w:val="EE0000"/>
                 <w:sz w:val="28"/>
                 <w:szCs w:val="32"/>
               </w:rPr>
@@ -316,51 +315,10 @@
               <w:rPr>
                 <w:rFonts w:cs="Arial"/>
                 <w:b/>
-                <w:color w:val="EE0000"/>
-                <w:sz w:val="28"/>
-                <w:szCs w:val="32"/>
-              </w:rPr>
-              <w:t>T.S.3.3.</w:t>
-            </w:r>
-            <w:r>
-              <w:rPr>
-                <w:rFonts w:cs="Arial"/>
-                <w:b/>
-                <w:color w:val="EE0000"/>
-                <w:sz w:val="28"/>
-                <w:szCs w:val="32"/>
-              </w:rPr>
-              <w:t>3</w:t>
-            </w:r>
-            <w:r>
-              <w:rPr>
-                <w:rFonts w:cs="Arial"/>
-                <w:b/>
-                <w:color w:val="EE0000"/>
-                <w:sz w:val="28"/>
-                <w:szCs w:val="32"/>
-              </w:rPr>
-              <w:t>.</w:t>
-            </w:r>
-            <w:r>
-              <w:rPr>
-                <w:rFonts w:cs="Arial"/>
-                <w:b/>
-                <w:color w:val="EE0000"/>
-                <w:sz w:val="28"/>
-                <w:szCs w:val="32"/>
-              </w:rPr>
-              <w:t>3</w:t>
-            </w:r>
-            <w:r>
-              <w:rPr>
-                <w:rFonts w:cs="Arial"/>
-                <w:b/>
-                <w:color w:val="EE0000"/>
-                <w:sz w:val="28"/>
-                <w:szCs w:val="32"/>
-              </w:rPr>
-              <w:t xml:space="preserve"> – Kramam</w:t>
+                <w:sz w:val="28"/>
+                <w:szCs w:val="32"/>
+              </w:rPr>
+              <w:t>T.S.3.3.3.3 – Kramam</w:t>
             </w:r>
           </w:p>
           <w:p>
@@ -377,7 +335,6 @@
               <w:rPr>
                 <w:rFonts w:cs="Arial"/>
                 <w:b/>
-                <w:color w:val="EE0000"/>
                 <w:sz w:val="28"/>
                 <w:szCs w:val="32"/>
               </w:rPr>
@@ -386,21 +343,10 @@
               <w:rPr>
                 <w:rFonts w:cs="Arial"/>
                 <w:b/>
-                <w:color w:val="EE0000"/>
-                <w:sz w:val="28"/>
-                <w:szCs w:val="32"/>
-              </w:rPr>
-              <w:t xml:space="preserve">Krama Vaakyam No. - </w:t>
-            </w:r>
-            <w:r>
-              <w:rPr>
-                <w:rFonts w:cs="Arial"/>
-                <w:b/>
-                <w:color w:val="EE0000"/>
-                <w:sz w:val="28"/>
-                <w:szCs w:val="32"/>
-              </w:rPr>
-              <w:t>9</w:t>
+                <w:sz w:val="28"/>
+                <w:szCs w:val="32"/>
+              </w:rPr>
+              <w:t>Krama Vaakyam No. - 9</w:t>
             </w:r>
           </w:p>
           <w:p>
@@ -417,7 +363,6 @@
               <w:rPr>
                 <w:rFonts w:cs="Arial"/>
                 <w:b/>
-                <w:color w:val="EE0000"/>
                 <w:sz w:val="28"/>
                 <w:szCs w:val="32"/>
               </w:rPr>
@@ -426,7 +371,6 @@
               <w:rPr>
                 <w:rFonts w:cs="Arial"/>
                 <w:b/>
-                <w:color w:val="EE0000"/>
                 <w:sz w:val="28"/>
                 <w:szCs w:val="32"/>
               </w:rPr>
@@ -436,7 +380,6 @@
               <w:rPr>
                 <w:rFonts w:cs="Arial"/>
                 <w:b/>
-                <w:color w:val="EE0000"/>
                 <w:szCs w:val="32"/>
               </w:rPr>
               <w:t>. -</w:t>
@@ -445,21 +388,10 @@
               <w:rPr>
                 <w:rFonts w:cs="Arial"/>
                 <w:b/>
-                <w:color w:val="EE0000"/>
                 <w:sz w:val="28"/>
                 <w:szCs w:val="28"/>
               </w:rPr>
-              <w:t xml:space="preserve"> </w:t>
-            </w:r>
-            <w:r>
-              <w:rPr>
-                <w:rFonts w:cs="Arial"/>
-                <w:b/>
-                <w:color w:val="EE0000"/>
-                <w:sz w:val="28"/>
-                <w:szCs w:val="28"/>
-              </w:rPr>
-              <w:t>7</w:t>
+              <w:t xml:space="preserve"> 7</w:t>
             </w:r>
           </w:p>
         </w:tc>
@@ -476,7 +408,6 @@
               <w:spacing w:line="252" w:lineRule="auto"/>
               <w:rPr>
                 <w:rFonts w:ascii="BRH Devanagari Extra" w:hAnsi="BRH Devanagari Extra" w:cs="BRH Devanagari Extra"/>
-                <w:color w:val="EE0000"/>
                 <w:sz w:val="40"/>
                 <w:szCs w:val="40"/>
               </w:rPr>
@@ -484,7 +415,6 @@
             <w:r>
               <w:rPr>
                 <w:rFonts w:ascii="BRH Devanagari Extra" w:hAnsi="BRH Devanagari Extra" w:cs="BRH Devanagari Extra"/>
-                <w:color w:val="EE0000"/>
                 <w:sz w:val="40"/>
                 <w:szCs w:val="40"/>
               </w:rPr>
@@ -494,7 +424,6 @@
               <w:rPr>
                 <w:rFonts w:ascii="BRH Malayalam Extra" w:hAnsi="BRH Malayalam Extra" w:cs="BRH Devanagari Extra"/>
                 <w:b/>
-                <w:color w:val="EE0000"/>
                 <w:sz w:val="32"/>
                 <w:szCs w:val="40"/>
               </w:rPr>
@@ -503,7 +432,6 @@
             <w:r>
               <w:rPr>
                 <w:rFonts w:ascii="BRH Devanagari Extra" w:hAnsi="BRH Devanagari Extra" w:cs="BRH Devanagari Extra"/>
-                <w:color w:val="EE0000"/>
                 <w:sz w:val="40"/>
                 <w:szCs w:val="40"/>
               </w:rPr>
@@ -513,7 +441,6 @@
               <w:rPr>
                 <w:rFonts w:ascii="BRH Malayalam Extra" w:hAnsi="BRH Malayalam Extra" w:cs="BRH Devanagari Extra"/>
                 <w:b/>
-                <w:color w:val="EE0000"/>
                 <w:sz w:val="32"/>
                 <w:szCs w:val="40"/>
               </w:rPr>
@@ -522,7 +449,6 @@
             <w:r>
               <w:rPr>
                 <w:rFonts w:ascii="BRH Devanagari Extra" w:hAnsi="BRH Devanagari Extra" w:cs="BRH Devanagari Extra"/>
-                <w:color w:val="EE0000"/>
                 <w:sz w:val="40"/>
                 <w:szCs w:val="40"/>
               </w:rPr>
@@ -531,7 +457,6 @@
             <w:r>
               <w:rPr>
                 <w:rFonts w:ascii="BRH Devanagari Extra" w:hAnsi="BRH Devanagari Extra" w:cs="BRH Devanagari Extra"/>
-                <w:color w:val="EE0000"/>
                 <w:sz w:val="40"/>
                 <w:szCs w:val="40"/>
                 <w:highlight w:val="yellow"/>
@@ -541,7 +466,6 @@
             <w:r>
               <w:rPr>
                 <w:rFonts w:ascii="BRH Devanagari Extra" w:hAnsi="BRH Devanagari Extra" w:cs="BRH Devanagari Extra"/>
-                <w:color w:val="EE0000"/>
                 <w:sz w:val="40"/>
                 <w:szCs w:val="40"/>
               </w:rPr>
@@ -551,7 +475,6 @@
               <w:rPr>
                 <w:rFonts w:ascii="BRH Malayalam Extra" w:hAnsi="BRH Malayalam Extra" w:cs="BRH Devanagari Extra"/>
                 <w:b/>
-                <w:color w:val="EE0000"/>
                 <w:sz w:val="32"/>
                 <w:szCs w:val="40"/>
               </w:rPr>
@@ -560,7 +483,6 @@
             <w:r>
               <w:rPr>
                 <w:rFonts w:ascii="BRH Devanagari Extra" w:hAnsi="BRH Devanagari Extra" w:cs="BRH Devanagari Extra"/>
-                <w:color w:val="EE0000"/>
                 <w:sz w:val="40"/>
                 <w:szCs w:val="40"/>
               </w:rPr>
@@ -581,7 +503,6 @@
               <w:spacing w:before="0" w:line="240" w:lineRule="auto"/>
               <w:rPr>
                 <w:rFonts w:ascii="BRH Devanagari Extra" w:hAnsi="BRH Devanagari Extra" w:cs="BRH Devanagari Extra"/>
-                <w:color w:val="EE0000"/>
                 <w:sz w:val="40"/>
                 <w:szCs w:val="40"/>
               </w:rPr>
@@ -589,7 +510,6 @@
             <w:r>
               <w:rPr>
                 <w:rFonts w:ascii="BRH Devanagari Extra" w:hAnsi="BRH Devanagari Extra" w:cs="BRH Devanagari Extra"/>
-                <w:color w:val="EE0000"/>
                 <w:sz w:val="40"/>
                 <w:szCs w:val="40"/>
               </w:rPr>
@@ -599,7 +519,6 @@
               <w:rPr>
                 <w:rFonts w:ascii="BRH Malayalam Extra" w:hAnsi="BRH Malayalam Extra" w:cs="BRH Devanagari Extra"/>
                 <w:b/>
-                <w:color w:val="EE0000"/>
                 <w:sz w:val="32"/>
                 <w:szCs w:val="40"/>
               </w:rPr>
@@ -608,7 +527,6 @@
             <w:r>
               <w:rPr>
                 <w:rFonts w:ascii="BRH Devanagari Extra" w:hAnsi="BRH Devanagari Extra" w:cs="BRH Devanagari Extra"/>
-                <w:color w:val="EE0000"/>
                 <w:sz w:val="40"/>
                 <w:szCs w:val="40"/>
               </w:rPr>
@@ -618,7 +536,6 @@
               <w:rPr>
                 <w:rFonts w:ascii="BRH Malayalam Extra" w:hAnsi="BRH Malayalam Extra" w:cs="BRH Devanagari Extra"/>
                 <w:b/>
-                <w:color w:val="EE0000"/>
                 <w:sz w:val="32"/>
                 <w:szCs w:val="40"/>
               </w:rPr>
@@ -627,7 +544,6 @@
             <w:r>
               <w:rPr>
                 <w:rFonts w:ascii="BRH Devanagari Extra" w:hAnsi="BRH Devanagari Extra" w:cs="BRH Devanagari Extra"/>
-                <w:color w:val="EE0000"/>
                 <w:sz w:val="40"/>
                 <w:szCs w:val="40"/>
               </w:rPr>
@@ -636,7 +552,6 @@
             <w:r>
               <w:rPr>
                 <w:rFonts w:ascii="BRH Devanagari Extra" w:hAnsi="BRH Devanagari Extra" w:cs="BRH Devanagari Extra"/>
-                <w:color w:val="EE0000"/>
                 <w:sz w:val="40"/>
                 <w:szCs w:val="40"/>
                 <w:highlight w:val="green"/>
@@ -646,7 +561,6 @@
             <w:r>
               <w:rPr>
                 <w:rFonts w:ascii="BRH Devanagari Extra" w:hAnsi="BRH Devanagari Extra" w:cs="BRH Devanagari Extra"/>
-                <w:color w:val="EE0000"/>
                 <w:sz w:val="40"/>
                 <w:szCs w:val="40"/>
               </w:rPr>
@@ -656,7 +570,6 @@
               <w:rPr>
                 <w:rFonts w:ascii="BRH Malayalam Extra" w:hAnsi="BRH Malayalam Extra" w:cs="BRH Devanagari Extra"/>
                 <w:b/>
-                <w:color w:val="EE0000"/>
                 <w:sz w:val="32"/>
                 <w:szCs w:val="40"/>
               </w:rPr>
@@ -665,7 +578,6 @@
             <w:r>
               <w:rPr>
                 <w:rFonts w:ascii="BRH Devanagari Extra" w:hAnsi="BRH Devanagari Extra" w:cs="BRH Devanagari Extra"/>
-                <w:color w:val="EE0000"/>
                 <w:sz w:val="40"/>
                 <w:szCs w:val="40"/>
               </w:rPr>
@@ -3644,7 +3556,7 @@
 </file>
 
 <file path=word/endnotes.xml><?xml version="1.0" encoding="utf-8"?>
-<w:endnotes xmlns:wpc="http://schemas.microsoft.com/office/word/2010/wordprocessingCanvas" xmlns:cx="http://schemas.microsoft.com/office/drawing/2014/chartex" xmlns:cx1="http://schemas.microsoft.com/office/drawing/2015/9/8/chartex" xmlns:cx2="http://schemas.microsoft.com/office/drawing/2015/10/21/chartex" xmlns:cx3="http://schemas.microsoft.com/office/drawing/2016/5/9/chartex" xmlns:cx4="http://schemas.microsoft.com/office/drawing/2016/5/10/chartex" xmlns:cx5="http://schemas.microsoft.com/office/drawing/2016/5/11/chartex" xmlns:cx6="http://schemas.microsoft.com/office/drawing/2016/5/12/chartex" xmlns:cx7="http://schemas.microsoft.com/office/drawing/2016/5/13/chartex" xmlns:cx8="http://schemas.microsoft.com/office/drawing/2016/5/14/chartex" xmlns:mc="http://schemas.openxmlformats.org/markup-compatibility/2006" xmlns:aink="http://schemas.microsoft.com/office/drawing/2016/ink" xmlns:am3d="http://schemas.microsoft.com/office/drawing/2017/model3d" xmlns:o="urn:schemas-microsoft-com:office:office" xmlns:oel="http://schemas.microsoft.com/office/2019/extlst" xmlns:r="http://schemas.openxmlformats.org/officeDocument/2006/relationships" xmlns:m="http://schemas.openxmlformats.org/officeDocument/2006/math" xmlns:v="urn:schemas-microsoft-com:vml" xmlns:wp14="http://schemas.microsoft.com/office/word/2010/wordprocessingDrawing" xmlns:wp="http://schemas.openxmlformats.org/drawingml/2006/wordprocessingDrawing" xmlns:w10="urn:schemas-microsoft-com:office:word" xmlns:w="http://schemas.openxmlformats.org/wordprocessingml/2006/main" xmlns:w14="http://schemas.microsoft.com/office/word/2010/wordml" xmlns:w15="http://schemas.microsoft.com/office/word/2012/wordml" xmlns:w16cex="http://schemas.microsoft.com/office/word/2018/wordml/cex" xmlns:w16cid="http://schemas.microsoft.com/office/word/2016/wordml/cid" xmlns:w16="http://schemas.microsoft.com/office/word/2018/wordml" xmlns:w16du="http://schemas.microsoft.com/office/word/2023/wordml/word16du" xmlns:w16sdtdh="http://schemas.microsoft.com/office/word/2020/wordml/sdtdatahash" xmlns:w16sdtfl="http://schemas.microsoft.com/office/word/2024/wordml/sdtformatlock" xmlns:w16se="http://schemas.microsoft.com/office/word/2015/wordml/symex" xmlns:wpg="http://schemas.microsoft.com/office/word/2010/wordprocessingGroup" xmlns:wpi="http://schemas.microsoft.com/office/word/2010/wordprocessingInk" xmlns:wne="http://schemas.microsoft.com/office/word/2006/wordml" xmlns:wps="http://schemas.microsoft.com/office/word/2010/wordprocessingShape" mc:Ignorable="w14 w15 w16se w16cid w16 w16cex w16sdtdh w16sdtfl w16du wp14">
+<w:endnotes xmlns:wpc="http://schemas.microsoft.com/office/word/2010/wordprocessingCanvas" xmlns:cx="http://schemas.microsoft.com/office/drawing/2014/chartex" xmlns:cx1="http://schemas.microsoft.com/office/drawing/2015/9/8/chartex" xmlns:cx2="http://schemas.microsoft.com/office/drawing/2015/10/21/chartex" xmlns:cx3="http://schemas.microsoft.com/office/drawing/2016/5/9/chartex" xmlns:cx4="http://schemas.microsoft.com/office/drawing/2016/5/10/chartex" xmlns:cx5="http://schemas.microsoft.com/office/drawing/2016/5/11/chartex" xmlns:cx6="http://schemas.microsoft.com/office/drawing/2016/5/12/chartex" xmlns:cx7="http://schemas.microsoft.com/office/drawing/2016/5/13/chartex" xmlns:cx8="http://schemas.microsoft.com/office/drawing/2016/5/14/chartex" xmlns:mc="http://schemas.openxmlformats.org/markup-compatibility/2006" xmlns:aink="http://schemas.microsoft.com/office/drawing/2016/ink" xmlns:am3d="http://schemas.microsoft.com/office/drawing/2017/model3d" xmlns:o="urn:schemas-microsoft-com:office:office" xmlns:oel="http://schemas.microsoft.com/office/2019/extlst" xmlns:r="http://schemas.openxmlformats.org/officeDocument/2006/relationships" xmlns:m="http://schemas.openxmlformats.org/officeDocument/2006/math" xmlns:v="urn:schemas-microsoft-com:vml" xmlns:wp14="http://schemas.microsoft.com/office/word/2010/wordprocessingDrawing" xmlns:wp="http://schemas.openxmlformats.org/drawingml/2006/wordprocessingDrawing" xmlns:w10="urn:schemas-microsoft-com:office:word" xmlns:w="http://schemas.openxmlformats.org/wordprocessingml/2006/main" xmlns:w14="http://schemas.microsoft.com/office/word/2010/wordml" xmlns:w15="http://schemas.microsoft.com/office/word/2012/wordml" xmlns:w16cei="http://schemas.microsoft.com/office/word/2026/wordml/cei" xmlns:w16cex="http://schemas.microsoft.com/office/word/2018/wordml/cex" xmlns:w16cid="http://schemas.microsoft.com/office/word/2016/wordml/cid" xmlns:w16="http://schemas.microsoft.com/office/word/2018/wordml" xmlns:w16du="http://schemas.microsoft.com/office/word/2023/wordml/word16du" xmlns:w16sdtdh="http://schemas.microsoft.com/office/word/2020/wordml/sdtdatahash" xmlns:w16sdtfl="http://schemas.microsoft.com/office/word/2024/wordml/sdtformatlock" xmlns:w16se="http://schemas.microsoft.com/office/word/2015/wordml/symex" xmlns:wpg="http://schemas.microsoft.com/office/word/2010/wordprocessingGroup" xmlns:wpi="http://schemas.microsoft.com/office/word/2010/wordprocessingInk" xmlns:wne="http://schemas.microsoft.com/office/word/2006/wordml" xmlns:wps="http://schemas.microsoft.com/office/word/2010/wordprocessingShape" mc:Ignorable="w14 w15 w16se w16cid w16 w16cex w16sdtdh w16sdtfl w16du wp14">
   <w:endnote w:type="separator" w:id="-1">
     <w:p>
       <w:pPr>
@@ -3669,7 +3581,7 @@
 </file>
 
 <file path=word/footer1.xml><?xml version="1.0" encoding="utf-8"?>
-<w:ftr xmlns:wpc="http://schemas.microsoft.com/office/word/2010/wordprocessingCanvas" xmlns:cx="http://schemas.microsoft.com/office/drawing/2014/chartex" xmlns:cx1="http://schemas.microsoft.com/office/drawing/2015/9/8/chartex" xmlns:cx2="http://schemas.microsoft.com/office/drawing/2015/10/21/chartex" xmlns:cx3="http://schemas.microsoft.com/office/drawing/2016/5/9/chartex" xmlns:cx4="http://schemas.microsoft.com/office/drawing/2016/5/10/chartex" xmlns:cx5="http://schemas.microsoft.com/office/drawing/2016/5/11/chartex" xmlns:cx6="http://schemas.microsoft.com/office/drawing/2016/5/12/chartex" xmlns:cx7="http://schemas.microsoft.com/office/drawing/2016/5/13/chartex" xmlns:cx8="http://schemas.microsoft.com/office/drawing/2016/5/14/chartex" xmlns:mc="http://schemas.openxmlformats.org/markup-compatibility/2006" xmlns:aink="http://schemas.microsoft.com/office/drawing/2016/ink" xmlns:am3d="http://schemas.microsoft.com/office/drawing/2017/model3d" xmlns:o="urn:schemas-microsoft-com:office:office" xmlns:oel="http://schemas.microsoft.com/office/2019/extlst" xmlns:r="http://schemas.openxmlformats.org/officeDocument/2006/relationships" xmlns:m="http://schemas.openxmlformats.org/officeDocument/2006/math" xmlns:v="urn:schemas-microsoft-com:vml" xmlns:wp14="http://schemas.microsoft.com/office/word/2010/wordprocessingDrawing" xmlns:wp="http://schemas.openxmlformats.org/drawingml/2006/wordprocessingDrawing" xmlns:w10="urn:schemas-microsoft-com:office:word" xmlns:w="http://schemas.openxmlformats.org/wordprocessingml/2006/main" xmlns:w14="http://schemas.microsoft.com/office/word/2010/wordml" xmlns:w15="http://schemas.microsoft.com/office/word/2012/wordml" xmlns:w16cex="http://schemas.microsoft.com/office/word/2018/wordml/cex" xmlns:w16cid="http://schemas.microsoft.com/office/word/2016/wordml/cid" xmlns:w16="http://schemas.microsoft.com/office/word/2018/wordml" xmlns:w16du="http://schemas.microsoft.com/office/word/2023/wordml/word16du" xmlns:w16sdtdh="http://schemas.microsoft.com/office/word/2020/wordml/sdtdatahash" xmlns:w16sdtfl="http://schemas.microsoft.com/office/word/2024/wordml/sdtformatlock" xmlns:w16se="http://schemas.microsoft.com/office/word/2015/wordml/symex" xmlns:wpg="http://schemas.microsoft.com/office/word/2010/wordprocessingGroup" xmlns:wpi="http://schemas.microsoft.com/office/word/2010/wordprocessingInk" xmlns:wne="http://schemas.microsoft.com/office/word/2006/wordml" xmlns:wps="http://schemas.microsoft.com/office/word/2010/wordprocessingShape" mc:Ignorable="w14 w15 w16se w16cid w16 w16cex w16sdtdh w16sdtfl w16du wp14">
+<w:ftr xmlns:wpc="http://schemas.microsoft.com/office/word/2010/wordprocessingCanvas" xmlns:cx="http://schemas.microsoft.com/office/drawing/2014/chartex" xmlns:cx1="http://schemas.microsoft.com/office/drawing/2015/9/8/chartex" xmlns:cx2="http://schemas.microsoft.com/office/drawing/2015/10/21/chartex" xmlns:cx3="http://schemas.microsoft.com/office/drawing/2016/5/9/chartex" xmlns:cx4="http://schemas.microsoft.com/office/drawing/2016/5/10/chartex" xmlns:cx5="http://schemas.microsoft.com/office/drawing/2016/5/11/chartex" xmlns:cx6="http://schemas.microsoft.com/office/drawing/2016/5/12/chartex" xmlns:cx7="http://schemas.microsoft.com/office/drawing/2016/5/13/chartex" xmlns:cx8="http://schemas.microsoft.com/office/drawing/2016/5/14/chartex" xmlns:mc="http://schemas.openxmlformats.org/markup-compatibility/2006" xmlns:aink="http://schemas.microsoft.com/office/drawing/2016/ink" xmlns:am3d="http://schemas.microsoft.com/office/drawing/2017/model3d" xmlns:o="urn:schemas-microsoft-com:office:office" xmlns:oel="http://schemas.microsoft.com/office/2019/extlst" xmlns:r="http://schemas.openxmlformats.org/officeDocument/2006/relationships" xmlns:m="http://schemas.openxmlformats.org/officeDocument/2006/math" xmlns:v="urn:schemas-microsoft-com:vml" xmlns:wp14="http://schemas.microsoft.com/office/word/2010/wordprocessingDrawing" xmlns:wp="http://schemas.openxmlformats.org/drawingml/2006/wordprocessingDrawing" xmlns:w10="urn:schemas-microsoft-com:office:word" xmlns:w="http://schemas.openxmlformats.org/wordprocessingml/2006/main" xmlns:w14="http://schemas.microsoft.com/office/word/2010/wordml" xmlns:w15="http://schemas.microsoft.com/office/word/2012/wordml" xmlns:w16cei="http://schemas.microsoft.com/office/word/2026/wordml/cei" xmlns:w16cex="http://schemas.microsoft.com/office/word/2018/wordml/cex" xmlns:w16cid="http://schemas.microsoft.com/office/word/2016/wordml/cid" xmlns:w16="http://schemas.microsoft.com/office/word/2018/wordml" xmlns:w16du="http://schemas.microsoft.com/office/word/2023/wordml/word16du" xmlns:w16sdtdh="http://schemas.microsoft.com/office/word/2020/wordml/sdtdatahash" xmlns:w16sdtfl="http://schemas.microsoft.com/office/word/2024/wordml/sdtformatlock" xmlns:w16se="http://schemas.microsoft.com/office/word/2015/wordml/symex" xmlns:wpg="http://schemas.microsoft.com/office/word/2010/wordprocessingGroup" xmlns:wpi="http://schemas.microsoft.com/office/word/2010/wordprocessingInk" xmlns:wne="http://schemas.microsoft.com/office/word/2006/wordml" xmlns:wps="http://schemas.microsoft.com/office/word/2010/wordprocessingShape" mc:Ignorable="w14 w15 w16se w16cid w16 w16cex w16sdtdh w16sdtfl w16du wp14">
   <w:p>
     <w:pPr>
       <w:pBdr>
@@ -3875,7 +3787,7 @@
 </file>
 
 <file path=word/footer2.xml><?xml version="1.0" encoding="utf-8"?>
-<w:ftr xmlns:wpc="http://schemas.microsoft.com/office/word/2010/wordprocessingCanvas" xmlns:cx="http://schemas.microsoft.com/office/drawing/2014/chartex" xmlns:cx1="http://schemas.microsoft.com/office/drawing/2015/9/8/chartex" xmlns:cx2="http://schemas.microsoft.com/office/drawing/2015/10/21/chartex" xmlns:cx3="http://schemas.microsoft.com/office/drawing/2016/5/9/chartex" xmlns:cx4="http://schemas.microsoft.com/office/drawing/2016/5/10/chartex" xmlns:cx5="http://schemas.microsoft.com/office/drawing/2016/5/11/chartex" xmlns:cx6="http://schemas.microsoft.com/office/drawing/2016/5/12/chartex" xmlns:cx7="http://schemas.microsoft.com/office/drawing/2016/5/13/chartex" xmlns:cx8="http://schemas.microsoft.com/office/drawing/2016/5/14/chartex" xmlns:mc="http://schemas.openxmlformats.org/markup-compatibility/2006" xmlns:aink="http://schemas.microsoft.com/office/drawing/2016/ink" xmlns:am3d="http://schemas.microsoft.com/office/drawing/2017/model3d" xmlns:o="urn:schemas-microsoft-com:office:office" xmlns:oel="http://schemas.microsoft.com/office/2019/extlst" xmlns:r="http://schemas.openxmlformats.org/officeDocument/2006/relationships" xmlns:m="http://schemas.openxmlformats.org/officeDocument/2006/math" xmlns:v="urn:schemas-microsoft-com:vml" xmlns:wp14="http://schemas.microsoft.com/office/word/2010/wordprocessingDrawing" xmlns:wp="http://schemas.openxmlformats.org/drawingml/2006/wordprocessingDrawing" xmlns:w10="urn:schemas-microsoft-com:office:word" xmlns:w="http://schemas.openxmlformats.org/wordprocessingml/2006/main" xmlns:w14="http://schemas.microsoft.com/office/word/2010/wordml" xmlns:w15="http://schemas.microsoft.com/office/word/2012/wordml" xmlns:w16cex="http://schemas.microsoft.com/office/word/2018/wordml/cex" xmlns:w16cid="http://schemas.microsoft.com/office/word/2016/wordml/cid" xmlns:w16="http://schemas.microsoft.com/office/word/2018/wordml" xmlns:w16du="http://schemas.microsoft.com/office/word/2023/wordml/word16du" xmlns:w16sdtdh="http://schemas.microsoft.com/office/word/2020/wordml/sdtdatahash" xmlns:w16sdtfl="http://schemas.microsoft.com/office/word/2024/wordml/sdtformatlock" xmlns:w16se="http://schemas.microsoft.com/office/word/2015/wordml/symex" xmlns:wpg="http://schemas.microsoft.com/office/word/2010/wordprocessingGroup" xmlns:wpi="http://schemas.microsoft.com/office/word/2010/wordprocessingInk" xmlns:wne="http://schemas.microsoft.com/office/word/2006/wordml" xmlns:wps="http://schemas.microsoft.com/office/word/2010/wordprocessingShape" mc:Ignorable="w14 w15 w16se w16cid w16 w16cex w16sdtdh w16sdtfl w16du wp14">
+<w:ftr xmlns:wpc="http://schemas.microsoft.com/office/word/2010/wordprocessingCanvas" xmlns:cx="http://schemas.microsoft.com/office/drawing/2014/chartex" xmlns:cx1="http://schemas.microsoft.com/office/drawing/2015/9/8/chartex" xmlns:cx2="http://schemas.microsoft.com/office/drawing/2015/10/21/chartex" xmlns:cx3="http://schemas.microsoft.com/office/drawing/2016/5/9/chartex" xmlns:cx4="http://schemas.microsoft.com/office/drawing/2016/5/10/chartex" xmlns:cx5="http://schemas.microsoft.com/office/drawing/2016/5/11/chartex" xmlns:cx6="http://schemas.microsoft.com/office/drawing/2016/5/12/chartex" xmlns:cx7="http://schemas.microsoft.com/office/drawing/2016/5/13/chartex" xmlns:cx8="http://schemas.microsoft.com/office/drawing/2016/5/14/chartex" xmlns:mc="http://schemas.openxmlformats.org/markup-compatibility/2006" xmlns:aink="http://schemas.microsoft.com/office/drawing/2016/ink" xmlns:am3d="http://schemas.microsoft.com/office/drawing/2017/model3d" xmlns:o="urn:schemas-microsoft-com:office:office" xmlns:oel="http://schemas.microsoft.com/office/2019/extlst" xmlns:r="http://schemas.openxmlformats.org/officeDocument/2006/relationships" xmlns:m="http://schemas.openxmlformats.org/officeDocument/2006/math" xmlns:v="urn:schemas-microsoft-com:vml" xmlns:wp14="http://schemas.microsoft.com/office/word/2010/wordprocessingDrawing" xmlns:wp="http://schemas.openxmlformats.org/drawingml/2006/wordprocessingDrawing" xmlns:w10="urn:schemas-microsoft-com:office:word" xmlns:w="http://schemas.openxmlformats.org/wordprocessingml/2006/main" xmlns:w14="http://schemas.microsoft.com/office/word/2010/wordml" xmlns:w15="http://schemas.microsoft.com/office/word/2012/wordml" xmlns:w16cei="http://schemas.microsoft.com/office/word/2026/wordml/cei" xmlns:w16cex="http://schemas.microsoft.com/office/word/2018/wordml/cex" xmlns:w16cid="http://schemas.microsoft.com/office/word/2016/wordml/cid" xmlns:w16="http://schemas.microsoft.com/office/word/2018/wordml" xmlns:w16du="http://schemas.microsoft.com/office/word/2023/wordml/word16du" xmlns:w16sdtdh="http://schemas.microsoft.com/office/word/2020/wordml/sdtdatahash" xmlns:w16sdtfl="http://schemas.microsoft.com/office/word/2024/wordml/sdtformatlock" xmlns:w16se="http://schemas.microsoft.com/office/word/2015/wordml/symex" xmlns:wpg="http://schemas.microsoft.com/office/word/2010/wordprocessingGroup" xmlns:wpi="http://schemas.microsoft.com/office/word/2010/wordprocessingInk" xmlns:wne="http://schemas.microsoft.com/office/word/2006/wordml" xmlns:wps="http://schemas.microsoft.com/office/word/2010/wordprocessingShape" mc:Ignorable="w14 w15 w16se w16cid w16 w16cex w16sdtdh w16sdtfl w16du wp14">
   <w:p>
     <w:pPr>
       <w:pBdr>
@@ -4091,7 +4003,7 @@
 </file>
 
 <file path=word/footnotes.xml><?xml version="1.0" encoding="utf-8"?>
-<w:footnotes xmlns:wpc="http://schemas.microsoft.com/office/word/2010/wordprocessingCanvas" xmlns:cx="http://schemas.microsoft.com/office/drawing/2014/chartex" xmlns:cx1="http://schemas.microsoft.com/office/drawing/2015/9/8/chartex" xmlns:cx2="http://schemas.microsoft.com/office/drawing/2015/10/21/chartex" xmlns:cx3="http://schemas.microsoft.com/office/drawing/2016/5/9/chartex" xmlns:cx4="http://schemas.microsoft.com/office/drawing/2016/5/10/chartex" xmlns:cx5="http://schemas.microsoft.com/office/drawing/2016/5/11/chartex" xmlns:cx6="http://schemas.microsoft.com/office/drawing/2016/5/12/chartex" xmlns:cx7="http://schemas.microsoft.com/office/drawing/2016/5/13/chartex" xmlns:cx8="http://schemas.microsoft.com/office/drawing/2016/5/14/chartex" xmlns:mc="http://schemas.openxmlformats.org/markup-compatibility/2006" xmlns:aink="http://schemas.microsoft.com/office/drawing/2016/ink" xmlns:am3d="http://schemas.microsoft.com/office/drawing/2017/model3d" xmlns:o="urn:schemas-microsoft-com:office:office" xmlns:oel="http://schemas.microsoft.com/office/2019/extlst" xmlns:r="http://schemas.openxmlformats.org/officeDocument/2006/relationships" xmlns:m="http://schemas.openxmlformats.org/officeDocument/2006/math" xmlns:v="urn:schemas-microsoft-com:vml" xmlns:wp14="http://schemas.microsoft.com/office/word/2010/wordprocessingDrawing" xmlns:wp="http://schemas.openxmlformats.org/drawingml/2006/wordprocessingDrawing" xmlns:w10="urn:schemas-microsoft-com:office:word" xmlns:w="http://schemas.openxmlformats.org/wordprocessingml/2006/main" xmlns:w14="http://schemas.microsoft.com/office/word/2010/wordml" xmlns:w15="http://schemas.microsoft.com/office/word/2012/wordml" xmlns:w16cex="http://schemas.microsoft.com/office/word/2018/wordml/cex" xmlns:w16cid="http://schemas.microsoft.com/office/word/2016/wordml/cid" xmlns:w16="http://schemas.microsoft.com/office/word/2018/wordml" xmlns:w16du="http://schemas.microsoft.com/office/word/2023/wordml/word16du" xmlns:w16sdtdh="http://schemas.microsoft.com/office/word/2020/wordml/sdtdatahash" xmlns:w16sdtfl="http://schemas.microsoft.com/office/word/2024/wordml/sdtformatlock" xmlns:w16se="http://schemas.microsoft.com/office/word/2015/wordml/symex" xmlns:wpg="http://schemas.microsoft.com/office/word/2010/wordprocessingGroup" xmlns:wpi="http://schemas.microsoft.com/office/word/2010/wordprocessingInk" xmlns:wne="http://schemas.microsoft.com/office/word/2006/wordml" xmlns:wps="http://schemas.microsoft.com/office/word/2010/wordprocessingShape" mc:Ignorable="w14 w15 w16se w16cid w16 w16cex w16sdtdh w16sdtfl w16du wp14">
+<w:footnotes xmlns:wpc="http://schemas.microsoft.com/office/word/2010/wordprocessingCanvas" xmlns:cx="http://schemas.microsoft.com/office/drawing/2014/chartex" xmlns:cx1="http://schemas.microsoft.com/office/drawing/2015/9/8/chartex" xmlns:cx2="http://schemas.microsoft.com/office/drawing/2015/10/21/chartex" xmlns:cx3="http://schemas.microsoft.com/office/drawing/2016/5/9/chartex" xmlns:cx4="http://schemas.microsoft.com/office/drawing/2016/5/10/chartex" xmlns:cx5="http://schemas.microsoft.com/office/drawing/2016/5/11/chartex" xmlns:cx6="http://schemas.microsoft.com/office/drawing/2016/5/12/chartex" xmlns:cx7="http://schemas.microsoft.com/office/drawing/2016/5/13/chartex" xmlns:cx8="http://schemas.microsoft.com/office/drawing/2016/5/14/chartex" xmlns:mc="http://schemas.openxmlformats.org/markup-compatibility/2006" xmlns:aink="http://schemas.microsoft.com/office/drawing/2016/ink" xmlns:am3d="http://schemas.microsoft.com/office/drawing/2017/model3d" xmlns:o="urn:schemas-microsoft-com:office:office" xmlns:oel="http://schemas.microsoft.com/office/2019/extlst" xmlns:r="http://schemas.openxmlformats.org/officeDocument/2006/relationships" xmlns:m="http://schemas.openxmlformats.org/officeDocument/2006/math" xmlns:v="urn:schemas-microsoft-com:vml" xmlns:wp14="http://schemas.microsoft.com/office/word/2010/wordprocessingDrawing" xmlns:wp="http://schemas.openxmlformats.org/drawingml/2006/wordprocessingDrawing" xmlns:w10="urn:schemas-microsoft-com:office:word" xmlns:w="http://schemas.openxmlformats.org/wordprocessingml/2006/main" xmlns:w14="http://schemas.microsoft.com/office/word/2010/wordml" xmlns:w15="http://schemas.microsoft.com/office/word/2012/wordml" xmlns:w16cei="http://schemas.microsoft.com/office/word/2026/wordml/cei" xmlns:w16cex="http://schemas.microsoft.com/office/word/2018/wordml/cex" xmlns:w16cid="http://schemas.microsoft.com/office/word/2016/wordml/cid" xmlns:w16="http://schemas.microsoft.com/office/word/2018/wordml" xmlns:w16du="http://schemas.microsoft.com/office/word/2023/wordml/word16du" xmlns:w16sdtdh="http://schemas.microsoft.com/office/word/2020/wordml/sdtdatahash" xmlns:w16sdtfl="http://schemas.microsoft.com/office/word/2024/wordml/sdtformatlock" xmlns:w16se="http://schemas.microsoft.com/office/word/2015/wordml/symex" xmlns:wpg="http://schemas.microsoft.com/office/word/2010/wordprocessingGroup" xmlns:wpi="http://schemas.microsoft.com/office/word/2010/wordprocessingInk" xmlns:wne="http://schemas.microsoft.com/office/word/2006/wordml" xmlns:wps="http://schemas.microsoft.com/office/word/2010/wordprocessingShape" mc:Ignorable="w14 w15 w16se w16cid w16 w16cex w16sdtdh w16sdtfl w16du wp14">
   <w:footnote w:type="separator" w:id="-1">
     <w:p>
       <w:pPr>
@@ -4116,7 +4028,7 @@
 </file>
 
 <file path=word/header1.xml><?xml version="1.0" encoding="utf-8"?>
-<w:hdr xmlns:wpc="http://schemas.microsoft.com/office/word/2010/wordprocessingCanvas" xmlns:cx="http://schemas.microsoft.com/office/drawing/2014/chartex" xmlns:cx1="http://schemas.microsoft.com/office/drawing/2015/9/8/chartex" xmlns:cx2="http://schemas.microsoft.com/office/drawing/2015/10/21/chartex" xmlns:cx3="http://schemas.microsoft.com/office/drawing/2016/5/9/chartex" xmlns:cx4="http://schemas.microsoft.com/office/drawing/2016/5/10/chartex" xmlns:cx5="http://schemas.microsoft.com/office/drawing/2016/5/11/chartex" xmlns:cx6="http://schemas.microsoft.com/office/drawing/2016/5/12/chartex" xmlns:cx7="http://schemas.microsoft.com/office/drawing/2016/5/13/chartex" xmlns:cx8="http://schemas.microsoft.com/office/drawing/2016/5/14/chartex" xmlns:mc="http://schemas.openxmlformats.org/markup-compatibility/2006" xmlns:aink="http://schemas.microsoft.com/office/drawing/2016/ink" xmlns:am3d="http://schemas.microsoft.com/office/drawing/2017/model3d" xmlns:o="urn:schemas-microsoft-com:office:office" xmlns:oel="http://schemas.microsoft.com/office/2019/extlst" xmlns:r="http://schemas.openxmlformats.org/officeDocument/2006/relationships" xmlns:m="http://schemas.openxmlformats.org/officeDocument/2006/math" xmlns:v="urn:schemas-microsoft-com:vml" xmlns:wp14="http://schemas.microsoft.com/office/word/2010/wordprocessingDrawing" xmlns:wp="http://schemas.openxmlformats.org/drawingml/2006/wordprocessingDrawing" xmlns:w10="urn:schemas-microsoft-com:office:word" xmlns:w="http://schemas.openxmlformats.org/wordprocessingml/2006/main" xmlns:w14="http://schemas.microsoft.com/office/word/2010/wordml" xmlns:w15="http://schemas.microsoft.com/office/word/2012/wordml" xmlns:w16cex="http://schemas.microsoft.com/office/word/2018/wordml/cex" xmlns:w16cid="http://schemas.microsoft.com/office/word/2016/wordml/cid" xmlns:w16="http://schemas.microsoft.com/office/word/2018/wordml" xmlns:w16du="http://schemas.microsoft.com/office/word/2023/wordml/word16du" xmlns:w16sdtdh="http://schemas.microsoft.com/office/word/2020/wordml/sdtdatahash" xmlns:w16sdtfl="http://schemas.microsoft.com/office/word/2024/wordml/sdtformatlock" xmlns:w16se="http://schemas.microsoft.com/office/word/2015/wordml/symex" xmlns:wpg="http://schemas.microsoft.com/office/word/2010/wordprocessingGroup" xmlns:wpi="http://schemas.microsoft.com/office/word/2010/wordprocessingInk" xmlns:wne="http://schemas.microsoft.com/office/word/2006/wordml" xmlns:wps="http://schemas.microsoft.com/office/word/2010/wordprocessingShape" mc:Ignorable="w14 w15 w16se w16cid w16 w16cex w16sdtdh w16sdtfl w16du wp14">
+<w:hdr xmlns:wpc="http://schemas.microsoft.com/office/word/2010/wordprocessingCanvas" xmlns:cx="http://schemas.microsoft.com/office/drawing/2014/chartex" xmlns:cx1="http://schemas.microsoft.com/office/drawing/2015/9/8/chartex" xmlns:cx2="http://schemas.microsoft.com/office/drawing/2015/10/21/chartex" xmlns:cx3="http://schemas.microsoft.com/office/drawing/2016/5/9/chartex" xmlns:cx4="http://schemas.microsoft.com/office/drawing/2016/5/10/chartex" xmlns:cx5="http://schemas.microsoft.com/office/drawing/2016/5/11/chartex" xmlns:cx6="http://schemas.microsoft.com/office/drawing/2016/5/12/chartex" xmlns:cx7="http://schemas.microsoft.com/office/drawing/2016/5/13/chartex" xmlns:cx8="http://schemas.microsoft.com/office/drawing/2016/5/14/chartex" xmlns:mc="http://schemas.openxmlformats.org/markup-compatibility/2006" xmlns:aink="http://schemas.microsoft.com/office/drawing/2016/ink" xmlns:am3d="http://schemas.microsoft.com/office/drawing/2017/model3d" xmlns:o="urn:schemas-microsoft-com:office:office" xmlns:oel="http://schemas.microsoft.com/office/2019/extlst" xmlns:r="http://schemas.openxmlformats.org/officeDocument/2006/relationships" xmlns:m="http://schemas.openxmlformats.org/officeDocument/2006/math" xmlns:v="urn:schemas-microsoft-com:vml" xmlns:wp14="http://schemas.microsoft.com/office/word/2010/wordprocessingDrawing" xmlns:wp="http://schemas.openxmlformats.org/drawingml/2006/wordprocessingDrawing" xmlns:w10="urn:schemas-microsoft-com:office:word" xmlns:w="http://schemas.openxmlformats.org/wordprocessingml/2006/main" xmlns:w14="http://schemas.microsoft.com/office/word/2010/wordml" xmlns:w15="http://schemas.microsoft.com/office/word/2012/wordml" xmlns:w16cei="http://schemas.microsoft.com/office/word/2026/wordml/cei" xmlns:w16cex="http://schemas.microsoft.com/office/word/2018/wordml/cex" xmlns:w16cid="http://schemas.microsoft.com/office/word/2016/wordml/cid" xmlns:w16="http://schemas.microsoft.com/office/word/2018/wordml" xmlns:w16du="http://schemas.microsoft.com/office/word/2023/wordml/word16du" xmlns:w16sdtdh="http://schemas.microsoft.com/office/word/2020/wordml/sdtdatahash" xmlns:w16sdtfl="http://schemas.microsoft.com/office/word/2024/wordml/sdtformatlock" xmlns:w16se="http://schemas.microsoft.com/office/word/2015/wordml/symex" xmlns:wpg="http://schemas.microsoft.com/office/word/2010/wordprocessingGroup" xmlns:wpi="http://schemas.microsoft.com/office/word/2010/wordprocessingInk" xmlns:wne="http://schemas.microsoft.com/office/word/2006/wordml" xmlns:wps="http://schemas.microsoft.com/office/word/2010/wordprocessingShape" mc:Ignorable="w14 w15 w16se w16cid w16 w16cex w16sdtdh w16sdtfl w16du wp14">
   <w:p>
     <w:pPr>
       <w:pStyle w:val="Header"/>
@@ -4129,7 +4041,7 @@
 </file>
 
 <file path=word/header2.xml><?xml version="1.0" encoding="utf-8"?>
-<w:hdr xmlns:wpc="http://schemas.microsoft.com/office/word/2010/wordprocessingCanvas" xmlns:cx="http://schemas.microsoft.com/office/drawing/2014/chartex" xmlns:cx1="http://schemas.microsoft.com/office/drawing/2015/9/8/chartex" xmlns:cx2="http://schemas.microsoft.com/office/drawing/2015/10/21/chartex" xmlns:cx3="http://schemas.microsoft.com/office/drawing/2016/5/9/chartex" xmlns:cx4="http://schemas.microsoft.com/office/drawing/2016/5/10/chartex" xmlns:cx5="http://schemas.microsoft.com/office/drawing/2016/5/11/chartex" xmlns:cx6="http://schemas.microsoft.com/office/drawing/2016/5/12/chartex" xmlns:cx7="http://schemas.microsoft.com/office/drawing/2016/5/13/chartex" xmlns:cx8="http://schemas.microsoft.com/office/drawing/2016/5/14/chartex" xmlns:mc="http://schemas.openxmlformats.org/markup-compatibility/2006" xmlns:aink="http://schemas.microsoft.com/office/drawing/2016/ink" xmlns:am3d="http://schemas.microsoft.com/office/drawing/2017/model3d" xmlns:o="urn:schemas-microsoft-com:office:office" xmlns:oel="http://schemas.microsoft.com/office/2019/extlst" xmlns:r="http://schemas.openxmlformats.org/officeDocument/2006/relationships" xmlns:m="http://schemas.openxmlformats.org/officeDocument/2006/math" xmlns:v="urn:schemas-microsoft-com:vml" xmlns:wp14="http://schemas.microsoft.com/office/word/2010/wordprocessingDrawing" xmlns:wp="http://schemas.openxmlformats.org/drawingml/2006/wordprocessingDrawing" xmlns:w10="urn:schemas-microsoft-com:office:word" xmlns:w="http://schemas.openxmlformats.org/wordprocessingml/2006/main" xmlns:w14="http://schemas.microsoft.com/office/word/2010/wordml" xmlns:w15="http://schemas.microsoft.com/office/word/2012/wordml" xmlns:w16cex="http://schemas.microsoft.com/office/word/2018/wordml/cex" xmlns:w16cid="http://schemas.microsoft.com/office/word/2016/wordml/cid" xmlns:w16="http://schemas.microsoft.com/office/word/2018/wordml" xmlns:w16du="http://schemas.microsoft.com/office/word/2023/wordml/word16du" xmlns:w16sdtdh="http://schemas.microsoft.com/office/word/2020/wordml/sdtdatahash" xmlns:w16sdtfl="http://schemas.microsoft.com/office/word/2024/wordml/sdtformatlock" xmlns:w16se="http://schemas.microsoft.com/office/word/2015/wordml/symex" xmlns:wpg="http://schemas.microsoft.com/office/word/2010/wordprocessingGroup" xmlns:wpi="http://schemas.microsoft.com/office/word/2010/wordprocessingInk" xmlns:wne="http://schemas.microsoft.com/office/word/2006/wordml" xmlns:wps="http://schemas.microsoft.com/office/word/2010/wordprocessingShape" mc:Ignorable="w14 w15 w16se w16cid w16 w16cex w16sdtdh w16sdtfl w16du wp14">
+<w:hdr xmlns:wpc="http://schemas.microsoft.com/office/word/2010/wordprocessingCanvas" xmlns:cx="http://schemas.microsoft.com/office/drawing/2014/chartex" xmlns:cx1="http://schemas.microsoft.com/office/drawing/2015/9/8/chartex" xmlns:cx2="http://schemas.microsoft.com/office/drawing/2015/10/21/chartex" xmlns:cx3="http://schemas.microsoft.com/office/drawing/2016/5/9/chartex" xmlns:cx4="http://schemas.microsoft.com/office/drawing/2016/5/10/chartex" xmlns:cx5="http://schemas.microsoft.com/office/drawing/2016/5/11/chartex" xmlns:cx6="http://schemas.microsoft.com/office/drawing/2016/5/12/chartex" xmlns:cx7="http://schemas.microsoft.com/office/drawing/2016/5/13/chartex" xmlns:cx8="http://schemas.microsoft.com/office/drawing/2016/5/14/chartex" xmlns:mc="http://schemas.openxmlformats.org/markup-compatibility/2006" xmlns:aink="http://schemas.microsoft.com/office/drawing/2016/ink" xmlns:am3d="http://schemas.microsoft.com/office/drawing/2017/model3d" xmlns:o="urn:schemas-microsoft-com:office:office" xmlns:oel="http://schemas.microsoft.com/office/2019/extlst" xmlns:r="http://schemas.openxmlformats.org/officeDocument/2006/relationships" xmlns:m="http://schemas.openxmlformats.org/officeDocument/2006/math" xmlns:v="urn:schemas-microsoft-com:vml" xmlns:wp14="http://schemas.microsoft.com/office/word/2010/wordprocessingDrawing" xmlns:wp="http://schemas.openxmlformats.org/drawingml/2006/wordprocessingDrawing" xmlns:w10="urn:schemas-microsoft-com:office:word" xmlns:w="http://schemas.openxmlformats.org/wordprocessingml/2006/main" xmlns:w14="http://schemas.microsoft.com/office/word/2010/wordml" xmlns:w15="http://schemas.microsoft.com/office/word/2012/wordml" xmlns:w16cei="http://schemas.microsoft.com/office/word/2026/wordml/cei" xmlns:w16cex="http://schemas.microsoft.com/office/word/2018/wordml/cex" xmlns:w16cid="http://schemas.microsoft.com/office/word/2016/wordml/cid" xmlns:w16="http://schemas.microsoft.com/office/word/2018/wordml" xmlns:w16du="http://schemas.microsoft.com/office/word/2023/wordml/word16du" xmlns:w16sdtdh="http://schemas.microsoft.com/office/word/2020/wordml/sdtdatahash" xmlns:w16sdtfl="http://schemas.microsoft.com/office/word/2024/wordml/sdtformatlock" xmlns:w16se="http://schemas.microsoft.com/office/word/2015/wordml/symex" xmlns:wpg="http://schemas.microsoft.com/office/word/2010/wordprocessingGroup" xmlns:wpi="http://schemas.microsoft.com/office/word/2010/wordprocessingInk" xmlns:wne="http://schemas.microsoft.com/office/word/2006/wordml" xmlns:wps="http://schemas.microsoft.com/office/word/2010/wordprocessingShape" mc:Ignorable="w14 w15 w16se w16cid w16 w16cex w16sdtdh w16sdtfl w16du wp14">
   <w:p>
     <w:pPr>
       <w:pStyle w:val="Header"/>

</xml_diff>